<commit_message>
validate KPIs + update dashboard + decision_log
</commit_message>
<xml_diff>
--- a/Từ điển KPI.docx
+++ b/Từ điển KPI.docx
@@ -2933,7 +2933,7 @@
           </w:p>
         </w:tc>
       </w:tr>
-      <w:tr>
+      <w:tr xmlns:wp14="http://schemas.microsoft.com/office/word/2010/wordml" wp14:textId="77777777">
         <w:trPr>
           <w:trHeight w:val="500"/>
         </w:trPr>
@@ -3101,7 +3101,7 @@
           </w:p>
         </w:tc>
       </w:tr>
-      <w:tr>
+      <w:tr xmlns:wp14="http://schemas.microsoft.com/office/word/2010/wordml" wp14:textId="77777777">
         <w:trPr>
           <w:trHeight w:val="500"/>
         </w:trPr>
@@ -3261,7 +3261,7 @@
           </w:p>
         </w:tc>
       </w:tr>
-      <w:tr>
+      <w:tr xmlns:wp14="http://schemas.microsoft.com/office/word/2010/wordml" wp14:textId="77777777">
         <w:trPr>
           <w:trHeight w:val="500"/>
         </w:trPr>
@@ -3425,7 +3425,7 @@
           </w:p>
         </w:tc>
       </w:tr>
-      <w:tr>
+      <w:tr xmlns:wp14="http://schemas.microsoft.com/office/word/2010/wordml" wp14:textId="77777777">
         <w:trPr>
           <w:trHeight w:val="500"/>
         </w:trPr>
@@ -3641,7 +3641,7 @@
           </w:p>
         </w:tc>
       </w:tr>
-      <w:tr>
+      <w:tr xmlns:wp14="http://schemas.microsoft.com/office/word/2010/wordml" wp14:textId="77777777">
         <w:trPr>
           <w:trHeight w:val="500"/>
         </w:trPr>
@@ -3840,7 +3840,7 @@
           </w:p>
         </w:tc>
       </w:tr>
-      <w:tr>
+      <w:tr xmlns:wp14="http://schemas.microsoft.com/office/word/2010/wordml" wp14:textId="77777777">
         <w:trPr>
           <w:trHeight w:val="500"/>
         </w:trPr>
@@ -4026,7 +4026,7 @@
           </w:p>
         </w:tc>
       </w:tr>
-      <w:tr>
+      <w:tr xmlns:wp14="http://schemas.microsoft.com/office/word/2010/wordml" wp14:textId="77777777">
         <w:trPr>
           <w:cantSplit/>
           <w:trHeight w:val="500"/>
@@ -4041,16 +4041,16 @@
               <w:bottom w:val="single" w:color="000000" w:themeColor="text1" w:sz="8" w:space="0"/>
               <w:right w:val="single" w:color="000000" w:themeColor="text1" w:sz="8" w:space="0"/>
             </w:tcBorders>
-            <w:shd w:val="clear" w:color="auto" w:fill="F2F2F2"/>
-            <w:tcMar>
-              <w:top w:w="100" w:type="dxa"/>
-              <w:left w:w="100" w:type="dxa"/>
-              <w:bottom w:w="100" w:type="dxa"/>
-              <w:right w:w="100" w:type="dxa"/>
-            </w:tcMar>
-            <w:hideMark/>
-          </w:tcPr>
-          <w:p>
+            <w:shd w:val="clear" w:color="auto" w:fill="F2F2F2" w:themeFill="background1" w:themeFillShade="F2"/>
+            <w:tcMar>
+              <w:top w:w="100" w:type="dxa"/>
+              <w:left w:w="100" w:type="dxa"/>
+              <w:bottom w:w="100" w:type="dxa"/>
+              <w:right w:w="100" w:type="dxa"/>
+            </w:tcMar>
+            <w:hideMark/>
+          </w:tcPr>
+          <w:p wp14:textId="77777777">
             <w:pPr>
               <w:pStyle w:val="Normal"/>
               <w:keepNext/>
@@ -4068,7 +4068,7 @@
           </w:p>
         </w:tc>
       </w:tr>
-      <w:tr>
+      <w:tr xmlns:wp14="http://schemas.microsoft.com/office/word/2010/wordml" wp14:textId="77777777">
         <w:trPr>
           <w:cantSplit/>
           <w:trHeight w:val="500"/>
@@ -4090,7 +4090,7 @@
             </w:tcMar>
             <w:hideMark/>
           </w:tcPr>
-          <w:p>
+          <w:p wp14:textId="77777777">
             <w:pPr>
               <w:pStyle w:val="Normal"/>
               <w:spacing w:after="0" w:line="240" w:lineRule="auto"/>
@@ -4123,7 +4123,7 @@
             </w:tcMar>
             <w:hideMark/>
           </w:tcPr>
-          <w:p>
+          <w:p wp14:textId="77777777">
             <w:pPr>
               <w:pStyle w:val="Normal"/>
               <w:spacing w:after="0" w:line="240" w:lineRule="auto"/>
@@ -4154,7 +4154,7 @@
             </w:tcMar>
             <w:hideMark/>
           </w:tcPr>
-          <w:p>
+          <w:p wp14:textId="77777777">
             <w:pPr>
               <w:pStyle w:val="Normal"/>
               <w:spacing w:after="0" w:line="240" w:lineRule="auto"/>
@@ -4185,7 +4185,7 @@
             </w:tcMar>
             <w:hideMark/>
           </w:tcPr>
-          <w:p>
+          <w:p wp14:textId="77777777">
             <w:pPr>
               <w:pStyle w:val="Normal"/>
               <w:spacing w:after="0" w:line="240" w:lineRule="auto"/>
@@ -4216,7 +4216,7 @@
             </w:tcMar>
             <w:hideMark/>
           </w:tcPr>
-          <w:p>
+          <w:p wp14:textId="77777777">
             <w:pPr>
               <w:pStyle w:val="Normal"/>
               <w:spacing w:after="0" w:line="240" w:lineRule="auto"/>
@@ -4229,7 +4229,7 @@
               <w:t xml:space="preserve">12.397 (18:00)</w:t>
             </w:r>
           </w:p>
-          <w:p>
+          <w:p wp14:textId="77777777">
             <w:pPr>
               <w:pStyle w:val="Normal"/>
               <w:spacing w:after="0" w:line="240" w:lineRule="auto"/>
@@ -4244,7 +4244,7 @@
           </w:p>
         </w:tc>
       </w:tr>
-      <w:tr>
+      <w:tr xmlns:wp14="http://schemas.microsoft.com/office/word/2010/wordml" wp14:textId="77777777">
         <w:trPr>
           <w:cantSplit/>
           <w:trHeight w:val="500"/>
@@ -4266,7 +4266,7 @@
             </w:tcMar>
             <w:hideMark/>
           </w:tcPr>
-          <w:p>
+          <w:p wp14:textId="77777777">
             <w:pPr>
               <w:pStyle w:val="Normal"/>
               <w:spacing w:after="0" w:line="240" w:lineRule="auto"/>
@@ -4299,7 +4299,7 @@
             </w:tcMar>
             <w:hideMark/>
           </w:tcPr>
-          <w:p>
+          <w:p wp14:textId="77777777">
             <w:pPr>
               <w:pStyle w:val="Normal"/>
               <w:spacing w:after="0" w:line="240" w:lineRule="auto"/>
@@ -4330,7 +4330,7 @@
             </w:tcMar>
             <w:hideMark/>
           </w:tcPr>
-          <w:p>
+          <w:p wp14:textId="77777777">
             <w:pPr>
               <w:pStyle w:val="Normal"/>
               <w:spacing w:after="0" w:line="240" w:lineRule="auto"/>
@@ -4361,7 +4361,7 @@
             </w:tcMar>
             <w:hideMark/>
           </w:tcPr>
-          <w:p>
+          <w:p wp14:textId="77777777">
             <w:pPr>
               <w:pStyle w:val="Normal"/>
               <w:spacing w:after="0" w:line="240" w:lineRule="auto"/>
@@ -4392,7 +4392,7 @@
             </w:tcMar>
             <w:hideMark/>
           </w:tcPr>
-          <w:p>
+          <w:p wp14:textId="77777777">
             <w:pPr>
               <w:pStyle w:val="Normal"/>
               <w:spacing w:after="0" w:line="240" w:lineRule="auto"/>
@@ -4407,7 +4407,7 @@
           </w:p>
         </w:tc>
       </w:tr>
-      <w:tr>
+      <w:tr xmlns:wp14="http://schemas.microsoft.com/office/word/2010/wordml" wp14:textId="77777777">
         <w:trPr>
           <w:cantSplit/>
           <w:trHeight w:val="500"/>
@@ -4429,7 +4429,7 @@
             </w:tcMar>
             <w:hideMark/>
           </w:tcPr>
-          <w:p>
+          <w:p wp14:textId="77777777">
             <w:pPr>
               <w:pStyle w:val="Normal"/>
               <w:spacing w:after="0" w:line="240" w:lineRule="auto"/>
@@ -4462,7 +4462,7 @@
             </w:tcMar>
             <w:hideMark/>
           </w:tcPr>
-          <w:p>
+          <w:p wp14:textId="77777777">
             <w:pPr>
               <w:pStyle w:val="Normal"/>
               <w:spacing w:after="0" w:line="240" w:lineRule="auto"/>
@@ -4493,7 +4493,7 @@
             </w:tcMar>
             <w:hideMark/>
           </w:tcPr>
-          <w:p>
+          <w:p wp14:textId="77777777">
             <w:pPr>
               <w:pStyle w:val="Normal"/>
               <w:spacing w:after="0" w:line="240" w:lineRule="auto"/>
@@ -4524,7 +4524,7 @@
             </w:tcMar>
             <w:hideMark/>
           </w:tcPr>
-          <w:p>
+          <w:p wp14:textId="77777777">
             <w:pPr>
               <w:pStyle w:val="Normal"/>
               <w:spacing w:after="0" w:line="240" w:lineRule="auto"/>
@@ -4555,7 +4555,7 @@
             </w:tcMar>
             <w:hideMark/>
           </w:tcPr>
-          <w:p>
+          <w:p wp14:textId="77777777">
             <w:pPr>
               <w:pStyle w:val="Normal"/>
               <w:spacing w:after="0" w:line="240" w:lineRule="auto"/>
@@ -4570,7 +4570,7 @@
           </w:p>
         </w:tc>
       </w:tr>
-      <w:tr>
+      <w:tr xmlns:wp14="http://schemas.microsoft.com/office/word/2010/wordml" wp14:textId="77777777">
         <w:trPr>
           <w:cantSplit/>
           <w:trHeight w:val="500"/>
@@ -4592,7 +4592,7 @@
             </w:tcMar>
             <w:hideMark/>
           </w:tcPr>
-          <w:p>
+          <w:p wp14:textId="77777777">
             <w:pPr>
               <w:pStyle w:val="Normal"/>
               <w:spacing w:after="0" w:line="240" w:lineRule="auto"/>
@@ -4625,7 +4625,7 @@
             </w:tcMar>
             <w:hideMark/>
           </w:tcPr>
-          <w:p>
+          <w:p wp14:textId="77777777">
             <w:pPr>
               <w:pStyle w:val="Normal"/>
               <w:spacing w:after="0" w:line="240" w:lineRule="auto"/>
@@ -4656,7 +4656,7 @@
             </w:tcMar>
             <w:hideMark/>
           </w:tcPr>
-          <w:p>
+          <w:p wp14:textId="77777777">
             <w:pPr>
               <w:pStyle w:val="Normal"/>
               <w:spacing w:after="0" w:line="240" w:lineRule="auto"/>
@@ -4687,7 +4687,7 @@
             </w:tcMar>
             <w:hideMark/>
           </w:tcPr>
-          <w:p>
+          <w:p wp14:textId="77777777">
             <w:pPr>
               <w:pStyle w:val="Normal"/>
               <w:spacing w:after="0" w:line="240" w:lineRule="auto"/>
@@ -4718,7 +4718,7 @@
             </w:tcMar>
             <w:hideMark/>
           </w:tcPr>
-          <w:p>
+          <w:p wp14:textId="77777777">
             <w:pPr>
               <w:pStyle w:val="Normal"/>
               <w:spacing w:after="0" w:line="240" w:lineRule="auto"/>
@@ -4733,7 +4733,7 @@
           </w:p>
         </w:tc>
       </w:tr>
-      <w:tr>
+      <w:tr xmlns:wp14="http://schemas.microsoft.com/office/word/2010/wordml" wp14:textId="77777777">
         <w:trPr>
           <w:cantSplit/>
           <w:trHeight w:val="500"/>
@@ -4755,7 +4755,7 @@
             </w:tcMar>
             <w:hideMark/>
           </w:tcPr>
-          <w:p>
+          <w:p wp14:textId="77777777">
             <w:pPr>
               <w:pStyle w:val="Normal"/>
               <w:spacing w:after="0" w:line="240" w:lineRule="auto"/>
@@ -4788,7 +4788,7 @@
             </w:tcMar>
             <w:hideMark/>
           </w:tcPr>
-          <w:p>
+          <w:p wp14:textId="77777777">
             <w:pPr>
               <w:pStyle w:val="Normal"/>
               <w:spacing w:after="0" w:line="240" w:lineRule="auto"/>
@@ -4819,7 +4819,7 @@
             </w:tcMar>
             <w:hideMark/>
           </w:tcPr>
-          <w:p>
+          <w:p wp14:textId="77777777">
             <w:pPr>
               <w:pStyle w:val="Normal"/>
               <w:spacing w:after="0" w:line="240" w:lineRule="auto"/>
@@ -4850,7 +4850,7 @@
             </w:tcMar>
             <w:hideMark/>
           </w:tcPr>
-          <w:p>
+          <w:p wp14:textId="77777777">
             <w:pPr>
               <w:pStyle w:val="Normal"/>
               <w:spacing w:after="0" w:line="240" w:lineRule="auto"/>
@@ -4881,7 +4881,7 @@
             </w:tcMar>
             <w:hideMark/>
           </w:tcPr>
-          <w:p>
+          <w:p wp14:textId="77777777">
             <w:pPr>
               <w:pStyle w:val="Normal"/>
               <w:spacing w:after="0" w:line="240" w:lineRule="auto"/>
@@ -4894,7 +4894,7 @@
               <w:t xml:space="preserve">Completion Rate: 60,9%–63,7%</w:t>
             </w:r>
           </w:p>
-          <w:p>
+          <w:p wp14:textId="77777777">
             <w:pPr>
               <w:pStyle w:val="Normal"/>
               <w:spacing w:after="0" w:line="240" w:lineRule="auto"/>
@@ -4907,7 +4907,7 @@
               <w:t xml:space="preserve">Unfulfilled Rate: 30,2%–33,4%</w:t>
             </w:r>
           </w:p>
-          <w:p>
+          <w:p wp14:textId="77777777">
             <w:pPr>
               <w:pStyle w:val="Normal"/>
               <w:spacing w:after="0" w:line="240" w:lineRule="auto"/>
@@ -4922,7 +4922,7 @@
           </w:p>
         </w:tc>
       </w:tr>
-      <w:tr>
+      <w:tr xmlns:wp14="http://schemas.microsoft.com/office/word/2010/wordml" wp14:textId="77777777">
         <w:trPr>
           <w:cantSplit/>
           <w:trHeight w:val="500"/>
@@ -4937,16 +4937,16 @@
               <w:bottom w:val="single" w:color="000000" w:themeColor="text1" w:sz="8" w:space="0"/>
               <w:right w:val="single" w:color="000000" w:themeColor="text1" w:sz="8" w:space="0"/>
             </w:tcBorders>
-            <w:shd w:val="clear" w:color="auto" w:fill="F2F2F2"/>
-            <w:tcMar>
-              <w:top w:w="100" w:type="dxa"/>
-              <w:left w:w="100" w:type="dxa"/>
-              <w:bottom w:w="100" w:type="dxa"/>
-              <w:right w:w="100" w:type="dxa"/>
-            </w:tcMar>
-            <w:hideMark/>
-          </w:tcPr>
-          <w:p>
+            <w:shd w:val="clear" w:color="auto" w:fill="F2F2F2" w:themeFill="background1" w:themeFillShade="F2"/>
+            <w:tcMar>
+              <w:top w:w="100" w:type="dxa"/>
+              <w:left w:w="100" w:type="dxa"/>
+              <w:bottom w:w="100" w:type="dxa"/>
+              <w:right w:w="100" w:type="dxa"/>
+            </w:tcMar>
+            <w:hideMark/>
+          </w:tcPr>
+          <w:p wp14:textId="77777777">
             <w:pPr>
               <w:pStyle w:val="Normal"/>
               <w:keepNext/>
@@ -4964,7 +4964,7 @@
           </w:p>
         </w:tc>
       </w:tr>
-      <w:tr>
+      <w:tr xmlns:wp14="http://schemas.microsoft.com/office/word/2010/wordml" wp14:textId="77777777">
         <w:trPr>
           <w:cantSplit/>
           <w:trHeight w:val="500"/>
@@ -4986,7 +4986,7 @@
             </w:tcMar>
             <w:hideMark/>
           </w:tcPr>
-          <w:p>
+          <w:p wp14:textId="77777777">
             <w:pPr>
               <w:pStyle w:val="Normal"/>
               <w:spacing w:after="0" w:line="240" w:lineRule="auto"/>
@@ -5019,7 +5019,7 @@
             </w:tcMar>
             <w:hideMark/>
           </w:tcPr>
-          <w:p>
+          <w:p wp14:textId="77777777">
             <w:pPr>
               <w:pStyle w:val="Normal"/>
               <w:spacing w:after="0" w:line="240" w:lineRule="auto"/>
@@ -5050,7 +5050,7 @@
             </w:tcMar>
             <w:hideMark/>
           </w:tcPr>
-          <w:p>
+          <w:p wp14:textId="77777777">
             <w:pPr>
               <w:pStyle w:val="Normal"/>
               <w:spacing w:after="0" w:line="240" w:lineRule="auto"/>
@@ -5081,7 +5081,7 @@
             </w:tcMar>
             <w:hideMark/>
           </w:tcPr>
-          <w:p>
+          <w:p wp14:textId="77777777">
             <w:pPr>
               <w:pStyle w:val="Normal"/>
               <w:spacing w:after="0" w:line="240" w:lineRule="auto"/>
@@ -5112,7 +5112,7 @@
             </w:tcMar>
             <w:hideMark/>
           </w:tcPr>
-          <w:p>
+          <w:p wp14:textId="77777777">
             <w:pPr>
               <w:pStyle w:val="Normal"/>
               <w:spacing w:after="0" w:line="240" w:lineRule="auto"/>
@@ -5127,7 +5127,7 @@
           </w:p>
         </w:tc>
       </w:tr>
-      <w:tr>
+      <w:tr xmlns:wp14="http://schemas.microsoft.com/office/word/2010/wordml" wp14:textId="77777777">
         <w:trPr>
           <w:cantSplit/>
           <w:trHeight w:val="500"/>
@@ -5149,7 +5149,7 @@
             </w:tcMar>
             <w:hideMark/>
           </w:tcPr>
-          <w:p>
+          <w:p wp14:textId="77777777">
             <w:pPr>
               <w:pStyle w:val="Normal"/>
               <w:spacing w:after="0" w:line="240" w:lineRule="auto"/>
@@ -5182,7 +5182,7 @@
             </w:tcMar>
             <w:hideMark/>
           </w:tcPr>
-          <w:p>
+          <w:p wp14:textId="77777777">
             <w:pPr>
               <w:pStyle w:val="Normal"/>
               <w:spacing w:after="0" w:line="240" w:lineRule="auto"/>
@@ -5213,7 +5213,7 @@
             </w:tcMar>
             <w:hideMark/>
           </w:tcPr>
-          <w:p>
+          <w:p wp14:textId="77777777">
             <w:pPr>
               <w:pStyle w:val="Normal"/>
               <w:spacing w:after="0" w:line="240" w:lineRule="auto"/>
@@ -5244,7 +5244,7 @@
             </w:tcMar>
             <w:hideMark/>
           </w:tcPr>
-          <w:p>
+          <w:p wp14:textId="77777777">
             <w:pPr>
               <w:pStyle w:val="Normal"/>
               <w:spacing w:after="0" w:line="240" w:lineRule="auto"/>
@@ -5275,7 +5275,7 @@
             </w:tcMar>
             <w:hideMark/>
           </w:tcPr>
-          <w:p>
+          <w:p wp14:textId="77777777">
             <w:pPr>
               <w:pStyle w:val="Normal"/>
               <w:spacing w:after="0" w:line="240" w:lineRule="auto"/>
@@ -5290,7 +5290,7 @@
           </w:p>
         </w:tc>
       </w:tr>
-      <w:tr>
+      <w:tr xmlns:wp14="http://schemas.microsoft.com/office/word/2010/wordml" wp14:textId="77777777">
         <w:trPr>
           <w:cantSplit/>
           <w:trHeight w:val="500"/>
@@ -5305,16 +5305,16 @@
               <w:bottom w:val="single" w:color="000000" w:themeColor="text1" w:sz="8" w:space="0"/>
               <w:right w:val="single" w:color="000000" w:themeColor="text1" w:sz="8" w:space="0"/>
             </w:tcBorders>
-            <w:shd w:val="clear" w:color="auto" w:fill="F2F2F2"/>
-            <w:tcMar>
-              <w:top w:w="100" w:type="dxa"/>
-              <w:left w:w="100" w:type="dxa"/>
-              <w:bottom w:w="100" w:type="dxa"/>
-              <w:right w:w="100" w:type="dxa"/>
-            </w:tcMar>
-            <w:hideMark/>
-          </w:tcPr>
-          <w:p>
+            <w:shd w:val="clear" w:color="auto" w:fill="F2F2F2" w:themeFill="background1" w:themeFillShade="F2"/>
+            <w:tcMar>
+              <w:top w:w="100" w:type="dxa"/>
+              <w:left w:w="100" w:type="dxa"/>
+              <w:bottom w:w="100" w:type="dxa"/>
+              <w:right w:w="100" w:type="dxa"/>
+            </w:tcMar>
+            <w:hideMark/>
+          </w:tcPr>
+          <w:p wp14:textId="77777777">
             <w:pPr>
               <w:pStyle w:val="Normal"/>
               <w:keepNext/>
@@ -5332,7 +5332,7 @@
           </w:p>
         </w:tc>
       </w:tr>
-      <w:tr>
+      <w:tr xmlns:wp14="http://schemas.microsoft.com/office/word/2010/wordml" wp14:textId="77777777">
         <w:trPr>
           <w:cantSplit/>
           <w:trHeight w:val="500"/>
@@ -5354,7 +5354,7 @@
             </w:tcMar>
             <w:hideMark/>
           </w:tcPr>
-          <w:p>
+          <w:p wp14:textId="77777777">
             <w:pPr>
               <w:pStyle w:val="Normal"/>
               <w:spacing w:after="0" w:line="240" w:lineRule="auto"/>
@@ -5387,7 +5387,7 @@
             </w:tcMar>
             <w:hideMark/>
           </w:tcPr>
-          <w:p>
+          <w:p wp14:textId="77777777">
             <w:pPr>
               <w:pStyle w:val="Normal"/>
               <w:spacing w:after="0" w:line="240" w:lineRule="auto"/>
@@ -5418,7 +5418,7 @@
             </w:tcMar>
             <w:hideMark/>
           </w:tcPr>
-          <w:p>
+          <w:p wp14:textId="77777777">
             <w:pPr>
               <w:pStyle w:val="Normal"/>
               <w:spacing w:after="0" w:line="240" w:lineRule="auto"/>
@@ -5449,7 +5449,7 @@
             </w:tcMar>
             <w:hideMark/>
           </w:tcPr>
-          <w:p>
+          <w:p wp14:textId="77777777">
             <w:pPr>
               <w:pStyle w:val="Normal"/>
               <w:spacing w:after="0" w:line="240" w:lineRule="auto"/>
@@ -5480,7 +5480,7 @@
             </w:tcMar>
             <w:hideMark/>
           </w:tcPr>
-          <w:p>
+          <w:p wp14:textId="77777777">
             <w:pPr>
               <w:pStyle w:val="Normal"/>
               <w:spacing w:after="0" w:line="240" w:lineRule="auto"/>
@@ -5493,7 +5493,7 @@
               <w:t xml:space="preserve">Cancelled by Customer: 12,51</w:t>
             </w:r>
           </w:p>
-          <w:p>
+          <w:p wp14:textId="77777777">
             <w:pPr>
               <w:pStyle w:val="Normal"/>
               <w:spacing w:after="0" w:line="240" w:lineRule="auto"/>
@@ -5506,7 +5506,7 @@
               <w:t xml:space="preserve">Completed: 8,51</w:t>
             </w:r>
           </w:p>
-          <w:p>
+          <w:p wp14:textId="77777777">
             <w:pPr>
               <w:pStyle w:val="Normal"/>
               <w:spacing w:after="0" w:line="240" w:lineRule="auto"/>
@@ -5519,7 +5519,7 @@
               <w:t xml:space="preserve">Cancelled by Driver: 7,50</w:t>
             </w:r>
           </w:p>
-          <w:p>
+          <w:p wp14:textId="77777777">
             <w:pPr>
               <w:pStyle w:val="Normal"/>
               <w:spacing w:after="0" w:line="240" w:lineRule="auto"/>
@@ -5534,7 +5534,7 @@
           </w:p>
         </w:tc>
       </w:tr>
-      <w:tr>
+      <w:tr xmlns:wp14="http://schemas.microsoft.com/office/word/2010/wordml" wp14:textId="77777777">
         <w:trPr>
           <w:cantSplit/>
           <w:trHeight w:val="500"/>
@@ -5556,7 +5556,7 @@
             </w:tcMar>
             <w:hideMark/>
           </w:tcPr>
-          <w:p>
+          <w:p wp14:textId="77777777">
             <w:pPr>
               <w:pStyle w:val="Normal"/>
               <w:spacing w:after="0" w:line="240" w:lineRule="auto"/>
@@ -5589,7 +5589,7 @@
             </w:tcMar>
             <w:hideMark/>
           </w:tcPr>
-          <w:p>
+          <w:p wp14:textId="77777777">
             <w:pPr>
               <w:pStyle w:val="Normal"/>
               <w:spacing w:after="0" w:line="240" w:lineRule="auto"/>
@@ -5620,7 +5620,7 @@
             </w:tcMar>
             <w:hideMark/>
           </w:tcPr>
-          <w:p>
+          <w:p wp14:textId="77777777">
             <w:pPr>
               <w:pStyle w:val="Normal"/>
               <w:spacing w:after="0" w:line="240" w:lineRule="auto"/>
@@ -5651,7 +5651,7 @@
             </w:tcMar>
             <w:hideMark/>
           </w:tcPr>
-          <w:p>
+          <w:p wp14:textId="77777777">
             <w:pPr>
               <w:pStyle w:val="Normal"/>
               <w:spacing w:after="0" w:line="240" w:lineRule="auto"/>
@@ -5682,7 +5682,7 @@
             </w:tcMar>
             <w:hideMark/>
           </w:tcPr>
-          <w:p>
+          <w:p wp14:textId="77777777">
             <w:pPr>
               <w:pStyle w:val="Normal"/>
               <w:spacing w:after="0" w:line="240" w:lineRule="auto"/>
@@ -5697,7 +5697,7 @@
           </w:p>
         </w:tc>
       </w:tr>
-      <w:tr>
+      <w:tr xmlns:wp14="http://schemas.microsoft.com/office/word/2010/wordml" wp14:textId="77777777">
         <w:trPr>
           <w:cantSplit/>
           <w:trHeight w:val="500"/>
@@ -5719,7 +5719,7 @@
             </w:tcMar>
             <w:hideMark/>
           </w:tcPr>
-          <w:p>
+          <w:p wp14:textId="77777777">
             <w:pPr>
               <w:pStyle w:val="Normal"/>
               <w:spacing w:after="0" w:line="240" w:lineRule="auto"/>
@@ -5752,7 +5752,7 @@
             </w:tcMar>
             <w:hideMark/>
           </w:tcPr>
-          <w:p>
+          <w:p wp14:textId="77777777">
             <w:pPr>
               <w:pStyle w:val="Normal"/>
               <w:spacing w:after="0" w:line="240" w:lineRule="auto"/>
@@ -5783,7 +5783,7 @@
             </w:tcMar>
             <w:hideMark/>
           </w:tcPr>
-          <w:p>
+          <w:p wp14:textId="77777777">
             <w:pPr>
               <w:pStyle w:val="Normal"/>
               <w:spacing w:after="0" w:line="240" w:lineRule="auto"/>
@@ -5814,7 +5814,7 @@
             </w:tcMar>
             <w:hideMark/>
           </w:tcPr>
-          <w:p>
+          <w:p wp14:textId="77777777">
             <w:pPr>
               <w:pStyle w:val="Normal"/>
               <w:spacing w:after="0" w:line="240" w:lineRule="auto"/>
@@ -5845,7 +5845,7 @@
             </w:tcMar>
             <w:hideMark/>
           </w:tcPr>
-          <w:p>
+          <w:p wp14:textId="77777777">
             <w:pPr>
               <w:pStyle w:val="Normal"/>
               <w:spacing w:after="0" w:line="240" w:lineRule="auto"/>
@@ -5860,7 +5860,7 @@
           </w:p>
         </w:tc>
       </w:tr>
-      <w:tr>
+      <w:tr xmlns:wp14="http://schemas.microsoft.com/office/word/2010/wordml" wp14:textId="77777777">
         <w:trPr>
           <w:cantSplit/>
           <w:trHeight w:val="500"/>
@@ -5882,7 +5882,7 @@
             </w:tcMar>
             <w:hideMark/>
           </w:tcPr>
-          <w:p>
+          <w:p wp14:textId="77777777">
             <w:pPr>
               <w:pStyle w:val="Normal"/>
               <w:spacing w:after="0" w:line="240" w:lineRule="auto"/>
@@ -5915,7 +5915,7 @@
             </w:tcMar>
             <w:hideMark/>
           </w:tcPr>
-          <w:p>
+          <w:p wp14:textId="77777777">
             <w:pPr>
               <w:pStyle w:val="Normal"/>
               <w:spacing w:after="0" w:line="240" w:lineRule="auto"/>
@@ -5946,7 +5946,7 @@
             </w:tcMar>
             <w:hideMark/>
           </w:tcPr>
-          <w:p>
+          <w:p wp14:textId="77777777">
             <w:pPr>
               <w:pStyle w:val="Normal"/>
               <w:spacing w:after="0" w:line="240" w:lineRule="auto"/>
@@ -5977,7 +5977,7 @@
             </w:tcMar>
             <w:hideMark/>
           </w:tcPr>
-          <w:p>
+          <w:p wp14:textId="77777777">
             <w:pPr>
               <w:pStyle w:val="Normal"/>
               <w:spacing w:after="0" w:line="240" w:lineRule="auto"/>
@@ -6008,7 +6008,7 @@
             </w:tcMar>
             <w:hideMark/>
           </w:tcPr>
-          <w:p>
+          <w:p wp14:textId="77777777">
             <w:pPr>
               <w:pStyle w:val="Normal"/>
               <w:spacing w:after="0" w:line="240" w:lineRule="auto"/>
@@ -6023,7 +6023,7 @@
           </w:p>
         </w:tc>
       </w:tr>
-      <w:tr>
+      <w:tr xmlns:wp14="http://schemas.microsoft.com/office/word/2010/wordml" wp14:textId="77777777">
         <w:trPr>
           <w:cantSplit/>
           <w:trHeight w:val="500"/>
@@ -6045,7 +6045,7 @@
             </w:tcMar>
             <w:hideMark/>
           </w:tcPr>
-          <w:p>
+          <w:p wp14:textId="77777777">
             <w:pPr>
               <w:pStyle w:val="Normal"/>
               <w:spacing w:after="0" w:line="240" w:lineRule="auto"/>
@@ -6078,7 +6078,7 @@
             </w:tcMar>
             <w:hideMark/>
           </w:tcPr>
-          <w:p>
+          <w:p wp14:textId="77777777">
             <w:pPr>
               <w:pStyle w:val="Normal"/>
               <w:spacing w:after="0" w:line="240" w:lineRule="auto"/>
@@ -6109,7 +6109,7 @@
             </w:tcMar>
             <w:hideMark/>
           </w:tcPr>
-          <w:p>
+          <w:p wp14:textId="77777777">
             <w:pPr>
               <w:pStyle w:val="Normal"/>
               <w:spacing w:after="0" w:line="240" w:lineRule="auto"/>
@@ -6140,7 +6140,7 @@
             </w:tcMar>
             <w:hideMark/>
           </w:tcPr>
-          <w:p>
+          <w:p wp14:textId="77777777">
             <w:pPr>
               <w:pStyle w:val="Normal"/>
               <w:spacing w:after="0" w:line="240" w:lineRule="auto"/>
@@ -6171,7 +6171,7 @@
             </w:tcMar>
             <w:hideMark/>
           </w:tcPr>
-          <w:p>
+          <w:p wp14:textId="77777777">
             <w:pPr>
               <w:pStyle w:val="Normal"/>
               <w:spacing w:after="0" w:line="240" w:lineRule="auto"/>
@@ -6184,7 +6184,7 @@
               <w:t xml:space="preserve">−0,004 (Customer Rating)</w:t>
             </w:r>
           </w:p>
-          <w:p>
+          <w:p wp14:textId="77777777">
             <w:pPr>
               <w:pStyle w:val="Normal"/>
               <w:spacing w:after="0" w:line="240" w:lineRule="auto"/>
@@ -6199,7 +6199,7 @@
           </w:p>
         </w:tc>
       </w:tr>
-      <w:tr>
+      <w:tr xmlns:wp14="http://schemas.microsoft.com/office/word/2010/wordml" wp14:textId="77777777">
         <w:trPr>
           <w:cantSplit/>
           <w:trHeight w:val="500"/>
@@ -6214,16 +6214,16 @@
               <w:bottom w:val="single" w:color="000000" w:themeColor="text1" w:sz="8" w:space="0"/>
               <w:right w:val="single" w:color="000000" w:themeColor="text1" w:sz="8" w:space="0"/>
             </w:tcBorders>
-            <w:shd w:val="clear" w:color="auto" w:fill="F2F2F2"/>
-            <w:tcMar>
-              <w:top w:w="100" w:type="dxa"/>
-              <w:left w:w="100" w:type="dxa"/>
-              <w:bottom w:w="100" w:type="dxa"/>
-              <w:right w:w="100" w:type="dxa"/>
-            </w:tcMar>
-            <w:hideMark/>
-          </w:tcPr>
-          <w:p>
+            <w:shd w:val="clear" w:color="auto" w:fill="F2F2F2" w:themeFill="background1" w:themeFillShade="F2"/>
+            <w:tcMar>
+              <w:top w:w="100" w:type="dxa"/>
+              <w:left w:w="100" w:type="dxa"/>
+              <w:bottom w:w="100" w:type="dxa"/>
+              <w:right w:w="100" w:type="dxa"/>
+            </w:tcMar>
+            <w:hideMark/>
+          </w:tcPr>
+          <w:p wp14:textId="77777777">
             <w:pPr>
               <w:pStyle w:val="Normal"/>
               <w:keepNext/>
@@ -6241,7 +6241,7 @@
           </w:p>
         </w:tc>
       </w:tr>
-      <w:tr>
+      <w:tr xmlns:wp14="http://schemas.microsoft.com/office/word/2010/wordml" wp14:textId="77777777">
         <w:trPr>
           <w:cantSplit/>
           <w:trHeight w:val="500"/>
@@ -6263,7 +6263,7 @@
             </w:tcMar>
             <w:hideMark/>
           </w:tcPr>
-          <w:p>
+          <w:p wp14:textId="77777777">
             <w:pPr>
               <w:pStyle w:val="Normal"/>
               <w:spacing w:after="0" w:line="240" w:lineRule="auto"/>
@@ -6296,7 +6296,7 @@
             </w:tcMar>
             <w:hideMark/>
           </w:tcPr>
-          <w:p>
+          <w:p wp14:textId="77777777">
             <w:pPr>
               <w:pStyle w:val="Normal"/>
               <w:spacing w:after="0" w:line="240" w:lineRule="auto"/>
@@ -6327,7 +6327,7 @@
             </w:tcMar>
             <w:hideMark/>
           </w:tcPr>
-          <w:p>
+          <w:p wp14:textId="77777777">
             <w:pPr>
               <w:pStyle w:val="Normal"/>
               <w:spacing w:after="0" w:line="240" w:lineRule="auto"/>
@@ -6358,7 +6358,7 @@
             </w:tcMar>
             <w:hideMark/>
           </w:tcPr>
-          <w:p>
+          <w:p wp14:textId="77777777">
             <w:pPr>
               <w:pStyle w:val="Normal"/>
               <w:spacing w:after="0" w:line="240" w:lineRule="auto"/>
@@ -6389,7 +6389,7 @@
             </w:tcMar>
             <w:hideMark/>
           </w:tcPr>
-          <w:p>
+          <w:p wp14:textId="77777777">
             <w:pPr>
               <w:pStyle w:val="Normal"/>
               <w:spacing w:after="0" w:line="240" w:lineRule="auto"/>
@@ -6402,7 +6402,7 @@
               <w:t xml:space="preserve">Cancelled by Driver ≈ 13,72 triệu (56,25%)</w:t>
             </w:r>
           </w:p>
-          <w:p>
+          <w:p wp14:textId="77777777">
             <w:pPr>
               <w:pStyle w:val="Normal"/>
               <w:spacing w:after="0" w:line="240" w:lineRule="auto"/>
@@ -6415,7 +6415,7 @@
               <w:t xml:space="preserve">Cancelled by Customer ≈ 5,34 triệu (21,88%)</w:t>
             </w:r>
           </w:p>
-          <w:p>
+          <w:p wp14:textId="77777777">
             <w:pPr>
               <w:pStyle w:val="Normal"/>
               <w:spacing w:after="0" w:line="240" w:lineRule="auto"/>
@@ -6430,7 +6430,7 @@
           </w:p>
         </w:tc>
       </w:tr>
-      <w:tr>
+      <w:tr xmlns:wp14="http://schemas.microsoft.com/office/word/2010/wordml" wp14:textId="77777777">
         <w:trPr>
           <w:cantSplit/>
           <w:trHeight w:val="500"/>
@@ -6452,7 +6452,7 @@
             </w:tcMar>
             <w:hideMark/>
           </w:tcPr>
-          <w:p>
+          <w:p wp14:textId="77777777">
             <w:pPr>
               <w:pStyle w:val="Normal"/>
               <w:spacing w:after="0" w:line="240" w:lineRule="auto"/>
@@ -6485,7 +6485,7 @@
             </w:tcMar>
             <w:hideMark/>
           </w:tcPr>
-          <w:p>
+          <w:p wp14:textId="77777777">
             <w:pPr>
               <w:pStyle w:val="Normal"/>
               <w:spacing w:after="0" w:line="240" w:lineRule="auto"/>
@@ -6516,7 +6516,7 @@
             </w:tcMar>
             <w:hideMark/>
           </w:tcPr>
-          <w:p>
+          <w:p wp14:textId="77777777">
             <w:pPr>
               <w:pStyle w:val="Normal"/>
               <w:spacing w:after="0" w:line="240" w:lineRule="auto"/>
@@ -6547,7 +6547,7 @@
             </w:tcMar>
             <w:hideMark/>
           </w:tcPr>
-          <w:p>
+          <w:p wp14:textId="77777777">
             <w:pPr>
               <w:pStyle w:val="Normal"/>
               <w:spacing w:after="0" w:line="240" w:lineRule="auto"/>
@@ -6578,7 +6578,7 @@
             </w:tcMar>
             <w:hideMark/>
           </w:tcPr>
-          <w:p>
+          <w:p wp14:textId="77777777">
             <w:pPr>
               <w:pStyle w:val="Normal"/>
               <w:spacing w:after="0" w:line="240" w:lineRule="auto"/>
@@ -6593,7 +6593,7 @@
           </w:p>
         </w:tc>
       </w:tr>
-      <w:tr>
+      <w:tr xmlns:wp14="http://schemas.microsoft.com/office/word/2010/wordml" wp14:textId="77777777">
         <w:trPr>
           <w:cantSplit/>
           <w:trHeight w:val="500"/>
@@ -6615,7 +6615,7 @@
             </w:tcMar>
             <w:hideMark/>
           </w:tcPr>
-          <w:p>
+          <w:p wp14:textId="77777777">
             <w:pPr>
               <w:pStyle w:val="Normal"/>
               <w:spacing w:after="0" w:line="240" w:lineRule="auto"/>
@@ -6648,7 +6648,7 @@
             </w:tcMar>
             <w:hideMark/>
           </w:tcPr>
-          <w:p>
+          <w:p wp14:textId="77777777">
             <w:pPr>
               <w:pStyle w:val="Normal"/>
               <w:spacing w:after="0" w:line="240" w:lineRule="auto"/>
@@ -6679,7 +6679,7 @@
             </w:tcMar>
             <w:hideMark/>
           </w:tcPr>
-          <w:p>
+          <w:p wp14:textId="77777777">
             <w:pPr>
               <w:pStyle w:val="Normal"/>
               <w:spacing w:after="0" w:line="240" w:lineRule="auto"/>
@@ -6710,7 +6710,7 @@
             </w:tcMar>
             <w:hideMark/>
           </w:tcPr>
-          <w:p>
+          <w:p wp14:textId="77777777">
             <w:pPr>
               <w:pStyle w:val="Normal"/>
               <w:spacing w:after="0" w:line="240" w:lineRule="auto"/>
@@ -6741,7 +6741,7 @@
             </w:tcMar>
             <w:hideMark/>
           </w:tcPr>
-          <w:p>
+          <w:p wp14:textId="77777777">
             <w:pPr>
               <w:pStyle w:val="Normal"/>
               <w:spacing w:after="0" w:line="240" w:lineRule="auto"/>
@@ -6754,7 +6754,7 @@
               <w:t xml:space="preserve">24,39 triệu khi 0%</w:t>
             </w:r>
           </w:p>
-          <w:p>
+          <w:p wp14:textId="77777777">
             <w:pPr>
               <w:pStyle w:val="Normal"/>
               <w:spacing w:after="0" w:line="240" w:lineRule="auto"/>
@@ -6767,7 +6767,7 @@
               <w:t xml:space="preserve">≈ 12,20 triệu khi 50%</w:t>
             </w:r>
           </w:p>
-          <w:p>
+          <w:p wp14:textId="77777777">
             <w:pPr>
               <w:pStyle w:val="Normal"/>
               <w:spacing w:after="0" w:line="240" w:lineRule="auto"/>
@@ -6782,7 +6782,7 @@
           </w:p>
         </w:tc>
       </w:tr>
-      <w:tr>
+      <w:tr xmlns:wp14="http://schemas.microsoft.com/office/word/2010/wordml" wp14:textId="77777777">
         <w:trPr>
           <w:cantSplit/>
           <w:trHeight w:val="500"/>
@@ -6804,7 +6804,7 @@
             </w:tcMar>
             <w:hideMark/>
           </w:tcPr>
-          <w:p>
+          <w:p wp14:textId="77777777">
             <w:pPr>
               <w:pStyle w:val="Normal"/>
               <w:spacing w:after="0" w:line="240" w:lineRule="auto"/>
@@ -6837,7 +6837,7 @@
             </w:tcMar>
             <w:hideMark/>
           </w:tcPr>
-          <w:p>
+          <w:p wp14:textId="77777777">
             <w:pPr>
               <w:pStyle w:val="Normal"/>
               <w:spacing w:after="0" w:line="240" w:lineRule="auto"/>
@@ -6868,7 +6868,7 @@
             </w:tcMar>
             <w:hideMark/>
           </w:tcPr>
-          <w:p>
+          <w:p wp14:textId="77777777">
             <w:pPr>
               <w:pStyle w:val="Normal"/>
               <w:spacing w:after="0" w:line="240" w:lineRule="auto"/>
@@ -6899,7 +6899,7 @@
             </w:tcMar>
             <w:hideMark/>
           </w:tcPr>
-          <w:p>
+          <w:p wp14:textId="77777777">
             <w:pPr>
               <w:pStyle w:val="Normal"/>
               <w:spacing w:after="0" w:line="240" w:lineRule="auto"/>
@@ -6930,7 +6930,7 @@
             </w:tcMar>
             <w:hideMark/>
           </w:tcPr>
-          <w:p>
+          <w:p wp14:textId="77777777">
             <w:pPr>
               <w:pStyle w:val="Normal"/>
               <w:spacing w:after="0" w:line="240" w:lineRule="auto"/>
@@ -6945,7 +6945,7 @@
           </w:p>
         </w:tc>
       </w:tr>
-      <w:tr>
+      <w:tr xmlns:wp14="http://schemas.microsoft.com/office/word/2010/wordml" wp14:textId="77777777">
         <w:trPr>
           <w:cantSplit/>
           <w:trHeight w:val="500"/>
@@ -6967,7 +6967,7 @@
             </w:tcMar>
             <w:hideMark/>
           </w:tcPr>
-          <w:p>
+          <w:p wp14:textId="77777777">
             <w:pPr>
               <w:pStyle w:val="Normal"/>
               <w:spacing w:after="0" w:line="240" w:lineRule="auto"/>
@@ -7000,7 +7000,7 @@
             </w:tcMar>
             <w:hideMark/>
           </w:tcPr>
-          <w:p>
+          <w:p wp14:textId="77777777">
             <w:pPr>
               <w:pStyle w:val="Normal"/>
               <w:spacing w:after="0" w:line="240" w:lineRule="auto"/>
@@ -7031,7 +7031,7 @@
             </w:tcMar>
             <w:hideMark/>
           </w:tcPr>
-          <w:p>
+          <w:p wp14:textId="77777777">
             <w:pPr>
               <w:pStyle w:val="Normal"/>
               <w:spacing w:after="0" w:line="240" w:lineRule="auto"/>
@@ -7062,7 +7062,7 @@
             </w:tcMar>
             <w:hideMark/>
           </w:tcPr>
-          <w:p>
+          <w:p wp14:textId="77777777">
             <w:pPr>
               <w:pStyle w:val="Normal"/>
               <w:spacing w:after="0" w:line="240" w:lineRule="auto"/>
@@ -7093,7 +7093,7 @@
             </w:tcMar>
             <w:hideMark/>
           </w:tcPr>
-          <w:p>
+          <w:p wp14:textId="77777777">
             <w:pPr>
               <w:pStyle w:val="Normal"/>
               <w:spacing w:after="0" w:line="240" w:lineRule="auto"/>
@@ -7108,7 +7108,7 @@
           </w:p>
         </w:tc>
       </w:tr>
-      <w:tr>
+      <w:tr xmlns:wp14="http://schemas.microsoft.com/office/word/2010/wordml" wp14:textId="77777777">
         <w:trPr>
           <w:cantSplit/>
           <w:trHeight w:val="500"/>
@@ -7123,16 +7123,16 @@
               <w:bottom w:val="single" w:color="000000" w:themeColor="text1" w:sz="8" w:space="0"/>
               <w:right w:val="single" w:color="000000" w:themeColor="text1" w:sz="8" w:space="0"/>
             </w:tcBorders>
-            <w:shd w:val="clear" w:color="auto" w:fill="F2F2F2"/>
-            <w:tcMar>
-              <w:top w:w="100" w:type="dxa"/>
-              <w:left w:w="100" w:type="dxa"/>
-              <w:bottom w:w="100" w:type="dxa"/>
-              <w:right w:w="100" w:type="dxa"/>
-            </w:tcMar>
-            <w:hideMark/>
-          </w:tcPr>
-          <w:p>
+            <w:shd w:val="clear" w:color="auto" w:fill="F2F2F2" w:themeFill="background1" w:themeFillShade="F2"/>
+            <w:tcMar>
+              <w:top w:w="100" w:type="dxa"/>
+              <w:left w:w="100" w:type="dxa"/>
+              <w:bottom w:w="100" w:type="dxa"/>
+              <w:right w:w="100" w:type="dxa"/>
+            </w:tcMar>
+            <w:hideMark/>
+          </w:tcPr>
+          <w:p wp14:textId="77777777">
             <w:pPr>
               <w:pStyle w:val="Normal"/>
               <w:keepNext/>
@@ -7150,7 +7150,7 @@
           </w:p>
         </w:tc>
       </w:tr>
-      <w:tr>
+      <w:tr xmlns:wp14="http://schemas.microsoft.com/office/word/2010/wordml" wp14:textId="77777777">
         <w:trPr>
           <w:cantSplit/>
           <w:trHeight w:val="500"/>
@@ -7172,7 +7172,7 @@
             </w:tcMar>
             <w:hideMark/>
           </w:tcPr>
-          <w:p>
+          <w:p wp14:textId="77777777">
             <w:pPr>
               <w:pStyle w:val="Normal"/>
               <w:spacing w:after="0" w:line="240" w:lineRule="auto"/>
@@ -7205,7 +7205,7 @@
             </w:tcMar>
             <w:hideMark/>
           </w:tcPr>
-          <w:p>
+          <w:p wp14:textId="77777777">
             <w:pPr>
               <w:pStyle w:val="Normal"/>
               <w:spacing w:after="0" w:line="240" w:lineRule="auto"/>
@@ -7236,7 +7236,7 @@
             </w:tcMar>
             <w:hideMark/>
           </w:tcPr>
-          <w:p>
+          <w:p wp14:textId="77777777">
             <w:pPr>
               <w:pStyle w:val="Normal"/>
               <w:spacing w:after="0" w:line="240" w:lineRule="auto"/>
@@ -7267,7 +7267,7 @@
             </w:tcMar>
             <w:hideMark/>
           </w:tcPr>
-          <w:p>
+          <w:p wp14:textId="77777777">
             <w:pPr>
               <w:pStyle w:val="Normal"/>
               <w:spacing w:after="0" w:line="240" w:lineRule="auto"/>
@@ -7298,7 +7298,7 @@
             </w:tcMar>
             <w:hideMark/>
           </w:tcPr>
-          <w:p>
+          <w:p wp14:textId="77777777">
             <w:pPr>
               <w:pStyle w:val="Normal"/>
               <w:spacing w:after="0" w:line="240" w:lineRule="auto"/>
@@ -7311,7 +7311,7 @@
               <w:t xml:space="preserve">Chung: 7,0%</w:t>
             </w:r>
           </w:p>
-          <w:p>
+          <w:p wp14:textId="77777777">
             <w:pPr>
               <w:pStyle w:val="Normal"/>
               <w:spacing w:after="0" w:line="240" w:lineRule="auto"/>
@@ -7326,7 +7326,7 @@
           </w:p>
         </w:tc>
       </w:tr>
-      <w:tr>
+      <w:tr xmlns:wp14="http://schemas.microsoft.com/office/word/2010/wordml" wp14:textId="77777777">
         <w:trPr>
           <w:cantSplit/>
           <w:trHeight w:val="500"/>
@@ -7348,7 +7348,7 @@
             </w:tcMar>
             <w:hideMark/>
           </w:tcPr>
-          <w:p>
+          <w:p wp14:textId="77777777">
             <w:pPr>
               <w:pStyle w:val="Normal"/>
               <w:spacing w:after="0" w:line="240" w:lineRule="auto"/>
@@ -7381,7 +7381,7 @@
             </w:tcMar>
             <w:hideMark/>
           </w:tcPr>
-          <w:p>
+          <w:p wp14:textId="77777777">
             <w:pPr>
               <w:pStyle w:val="Normal"/>
               <w:spacing w:after="0" w:line="240" w:lineRule="auto"/>
@@ -7412,7 +7412,7 @@
             </w:tcMar>
             <w:hideMark/>
           </w:tcPr>
-          <w:p>
+          <w:p wp14:textId="77777777">
             <w:pPr>
               <w:pStyle w:val="Normal"/>
               <w:spacing w:after="0" w:line="240" w:lineRule="auto"/>
@@ -7443,7 +7443,7 @@
             </w:tcMar>
             <w:hideMark/>
           </w:tcPr>
-          <w:p>
+          <w:p wp14:textId="77777777">
             <w:pPr>
               <w:pStyle w:val="Normal"/>
               <w:spacing w:after="0" w:line="240" w:lineRule="auto"/>
@@ -7474,7 +7474,7 @@
             </w:tcMar>
             <w:hideMark/>
           </w:tcPr>
-          <w:p>
+          <w:p wp14:textId="77777777">
             <w:pPr>
               <w:pStyle w:val="Normal"/>
               <w:spacing w:after="0" w:line="240" w:lineRule="auto"/>
@@ -7487,7 +7487,7 @@
               <w:t xml:space="preserve">p = 7,0%, n = 852: 4,4%–9,6%</w:t>
             </w:r>
           </w:p>
-          <w:p>
+          <w:p wp14:textId="77777777">
             <w:pPr>
               <w:pStyle w:val="Normal"/>
               <w:spacing w:after="0" w:line="240" w:lineRule="auto"/>
@@ -7500,7 +7500,7 @@
               <w:t xml:space="preserve">Vượt giới hạn trên: 1 địa điểm (Old Gurgaon)</w:t>
             </w:r>
           </w:p>
-          <w:p>
+          <w:p wp14:textId="77777777">
             <w:pPr>
               <w:pStyle w:val="Normal"/>
               <w:spacing w:after="0" w:line="240" w:lineRule="auto"/>
@@ -7515,7 +7515,7 @@
           </w:p>
         </w:tc>
       </w:tr>
-      <w:tr>
+      <w:tr xmlns:wp14="http://schemas.microsoft.com/office/word/2010/wordml" wp14:textId="77777777">
         <w:trPr>
           <w:cantSplit/>
           <w:trHeight w:val="500"/>
@@ -7530,16 +7530,16 @@
               <w:bottom w:val="single" w:color="000000" w:themeColor="text1" w:sz="8" w:space="0"/>
               <w:right w:val="single" w:color="000000" w:themeColor="text1" w:sz="8" w:space="0"/>
             </w:tcBorders>
-            <w:shd w:val="clear" w:color="auto" w:fill="F2F2F2"/>
-            <w:tcMar>
-              <w:top w:w="100" w:type="dxa"/>
-              <w:left w:w="100" w:type="dxa"/>
-              <w:bottom w:w="100" w:type="dxa"/>
-              <w:right w:w="100" w:type="dxa"/>
-            </w:tcMar>
-            <w:hideMark/>
-          </w:tcPr>
-          <w:p>
+            <w:shd w:val="clear" w:color="auto" w:fill="F2F2F2" w:themeFill="background1" w:themeFillShade="F2"/>
+            <w:tcMar>
+              <w:top w:w="100" w:type="dxa"/>
+              <w:left w:w="100" w:type="dxa"/>
+              <w:bottom w:w="100" w:type="dxa"/>
+              <w:right w:w="100" w:type="dxa"/>
+            </w:tcMar>
+            <w:hideMark/>
+          </w:tcPr>
+          <w:p wp14:textId="77777777">
             <w:pPr>
               <w:pStyle w:val="Normal"/>
               <w:keepNext/>
@@ -7557,7 +7557,7 @@
           </w:p>
         </w:tc>
       </w:tr>
-      <w:tr>
+      <w:tr xmlns:wp14="http://schemas.microsoft.com/office/word/2010/wordml" wp14:textId="77777777">
         <w:trPr>
           <w:cantSplit/>
           <w:trHeight w:val="500"/>
@@ -7579,7 +7579,7 @@
             </w:tcMar>
             <w:hideMark/>
           </w:tcPr>
-          <w:p>
+          <w:p wp14:textId="77777777">
             <w:pPr>
               <w:pStyle w:val="Normal"/>
               <w:spacing w:after="0" w:line="240" w:lineRule="auto"/>
@@ -7612,7 +7612,7 @@
             </w:tcMar>
             <w:hideMark/>
           </w:tcPr>
-          <w:p>
+          <w:p wp14:textId="77777777">
             <w:pPr>
               <w:pStyle w:val="Normal"/>
               <w:spacing w:after="0" w:line="240" w:lineRule="auto"/>
@@ -7643,7 +7643,7 @@
             </w:tcMar>
             <w:hideMark/>
           </w:tcPr>
-          <w:p>
+          <w:p wp14:textId="77777777">
             <w:pPr>
               <w:pStyle w:val="Normal"/>
               <w:spacing w:after="0" w:line="240" w:lineRule="auto"/>
@@ -7674,7 +7674,7 @@
             </w:tcMar>
             <w:hideMark/>
           </w:tcPr>
-          <w:p>
+          <w:p wp14:textId="77777777">
             <w:pPr>
               <w:pStyle w:val="Normal"/>
               <w:spacing w:after="0" w:line="240" w:lineRule="auto"/>
@@ -7705,7 +7705,7 @@
             </w:tcMar>
             <w:hideMark/>
           </w:tcPr>
-          <w:p>
+          <w:p wp14:textId="77777777">
             <w:pPr>
               <w:pStyle w:val="Normal"/>
               <w:spacing w:after="0" w:line="240" w:lineRule="auto"/>
@@ -7720,7 +7720,7 @@
           </w:p>
         </w:tc>
       </w:tr>
-      <w:tr>
+      <w:tr xmlns:wp14="http://schemas.microsoft.com/office/word/2010/wordml" wp14:textId="77777777">
         <w:trPr>
           <w:cantSplit/>
           <w:trHeight w:val="500"/>
@@ -7742,7 +7742,7 @@
             </w:tcMar>
             <w:hideMark/>
           </w:tcPr>
-          <w:p>
+          <w:p wp14:textId="77777777">
             <w:pPr>
               <w:pStyle w:val="Normal"/>
               <w:spacing w:after="0" w:line="240" w:lineRule="auto"/>
@@ -7775,7 +7775,7 @@
             </w:tcMar>
             <w:hideMark/>
           </w:tcPr>
-          <w:p>
+          <w:p wp14:textId="77777777">
             <w:pPr>
               <w:pStyle w:val="Normal"/>
               <w:spacing w:after="0" w:line="240" w:lineRule="auto"/>
@@ -7806,7 +7806,7 @@
             </w:tcMar>
             <w:hideMark/>
           </w:tcPr>
-          <w:p>
+          <w:p wp14:textId="77777777">
             <w:pPr>
               <w:pStyle w:val="Normal"/>
               <w:spacing w:after="0" w:line="240" w:lineRule="auto"/>
@@ -7837,7 +7837,7 @@
             </w:tcMar>
             <w:hideMark/>
           </w:tcPr>
-          <w:p>
+          <w:p wp14:textId="77777777">
             <w:pPr>
               <w:pStyle w:val="Normal"/>
               <w:spacing w:after="0" w:line="240" w:lineRule="auto"/>
@@ -7868,7 +7868,7 @@
             </w:tcMar>
             <w:hideMark/>
           </w:tcPr>
-          <w:p>
+          <w:p wp14:textId="77777777">
             <w:pPr>
               <w:pStyle w:val="Normal"/>
               <w:spacing w:after="0" w:line="240" w:lineRule="auto"/>
@@ -7883,7 +7883,7 @@
           </w:p>
         </w:tc>
       </w:tr>
-      <w:tr>
+      <w:tr xmlns:wp14="http://schemas.microsoft.com/office/word/2010/wordml" wp14:textId="77777777">
         <w:trPr>
           <w:cantSplit/>
           <w:trHeight w:val="500"/>
@@ -7905,7 +7905,7 @@
             </w:tcMar>
             <w:hideMark/>
           </w:tcPr>
-          <w:p>
+          <w:p wp14:textId="77777777">
             <w:pPr>
               <w:pStyle w:val="Normal"/>
               <w:spacing w:after="0" w:line="240" w:lineRule="auto"/>
@@ -7938,7 +7938,7 @@
             </w:tcMar>
             <w:hideMark/>
           </w:tcPr>
-          <w:p>
+          <w:p wp14:textId="77777777">
             <w:pPr>
               <w:pStyle w:val="Normal"/>
               <w:spacing w:after="0" w:line="240" w:lineRule="auto"/>
@@ -7969,7 +7969,7 @@
             </w:tcMar>
             <w:hideMark/>
           </w:tcPr>
-          <w:p>
+          <w:p wp14:textId="77777777">
             <w:pPr>
               <w:pStyle w:val="Normal"/>
               <w:spacing w:after="0" w:line="240" w:lineRule="auto"/>
@@ -8000,7 +8000,7 @@
             </w:tcMar>
             <w:hideMark/>
           </w:tcPr>
-          <w:p>
+          <w:p wp14:textId="77777777">
             <w:pPr>
               <w:pStyle w:val="Normal"/>
               <w:spacing w:after="0" w:line="240" w:lineRule="auto"/>
@@ -8031,7 +8031,7 @@
             </w:tcMar>
             <w:hideMark/>
           </w:tcPr>
-          <w:p>
+          <w:p wp14:textId="77777777">
             <w:pPr>
               <w:pStyle w:val="Normal"/>
               <w:spacing w:after="0" w:line="240" w:lineRule="auto"/>
@@ -8044,7 +8044,7 @@
               <w:t xml:space="preserve">&gt; 200: 1,91% (1.779)</w:t>
             </w:r>
           </w:p>
-          <w:p>
+          <w:p wp14:textId="77777777">
             <w:pPr>
               <w:pStyle w:val="Normal"/>
               <w:spacing w:after="0" w:line="240" w:lineRule="auto"/>
@@ -8059,7 +8059,7 @@
           </w:p>
         </w:tc>
       </w:tr>
-      <w:tr>
+      <w:tr xmlns:wp14="http://schemas.microsoft.com/office/word/2010/wordml" wp14:textId="77777777">
         <w:trPr>
           <w:cantSplit/>
           <w:trHeight w:val="500"/>
@@ -8081,7 +8081,7 @@
             </w:tcMar>
             <w:hideMark/>
           </w:tcPr>
-          <w:p>
+          <w:p wp14:textId="77777777">
             <w:pPr>
               <w:pStyle w:val="Normal"/>
               <w:spacing w:after="0" w:line="240" w:lineRule="auto"/>
@@ -8114,7 +8114,7 @@
             </w:tcMar>
             <w:hideMark/>
           </w:tcPr>
-          <w:p>
+          <w:p wp14:textId="77777777">
             <w:pPr>
               <w:pStyle w:val="Normal"/>
               <w:spacing w:after="0" w:line="240" w:lineRule="auto"/>
@@ -8145,7 +8145,7 @@
             </w:tcMar>
             <w:hideMark/>
           </w:tcPr>
-          <w:p>
+          <w:p wp14:textId="77777777">
             <w:pPr>
               <w:pStyle w:val="Normal"/>
               <w:spacing w:after="0" w:line="240" w:lineRule="auto"/>
@@ -8176,7 +8176,7 @@
             </w:tcMar>
             <w:hideMark/>
           </w:tcPr>
-          <w:p>
+          <w:p wp14:textId="77777777">
             <w:pPr>
               <w:pStyle w:val="Normal"/>
               <w:spacing w:after="0" w:line="240" w:lineRule="auto"/>
@@ -8207,7 +8207,7 @@
             </w:tcMar>
             <w:hideMark/>
           </w:tcPr>
-          <w:p>
+          <w:p wp14:textId="77777777">
             <w:pPr>
               <w:pStyle w:val="Normal"/>
               <w:spacing w:after="0" w:line="240" w:lineRule="auto"/>
@@ -8220,7 +8220,7 @@
               <w:t xml:space="preserve">Completed: 26,0</w:t>
             </w:r>
           </w:p>
-          <w:p>
+          <w:p wp14:textId="77777777">
             <w:pPr>
               <w:pStyle w:val="Normal"/>
               <w:spacing w:after="0" w:line="240" w:lineRule="auto"/>
@@ -8235,7 +8235,7 @@
           </w:p>
         </w:tc>
       </w:tr>
-      <w:tr>
+      <w:tr xmlns:wp14="http://schemas.microsoft.com/office/word/2010/wordml" wp14:textId="77777777">
         <w:trPr>
           <w:cantSplit/>
           <w:trHeight w:val="500"/>
@@ -8257,7 +8257,7 @@
             </w:tcMar>
             <w:hideMark/>
           </w:tcPr>
-          <w:p>
+          <w:p wp14:textId="77777777">
             <w:pPr>
               <w:pStyle w:val="Normal"/>
               <w:spacing w:after="0" w:line="240" w:lineRule="auto"/>
@@ -8290,7 +8290,7 @@
             </w:tcMar>
             <w:hideMark/>
           </w:tcPr>
-          <w:p>
+          <w:p wp14:textId="77777777">
             <w:pPr>
               <w:pStyle w:val="Normal"/>
               <w:spacing w:after="0" w:line="240" w:lineRule="auto"/>
@@ -8321,7 +8321,7 @@
             </w:tcMar>
             <w:hideMark/>
           </w:tcPr>
-          <w:p>
+          <w:p wp14:textId="77777777">
             <w:pPr>
               <w:pStyle w:val="Normal"/>
               <w:spacing w:after="0" w:line="240" w:lineRule="auto"/>
@@ -8352,7 +8352,7 @@
             </w:tcMar>
             <w:hideMark/>
           </w:tcPr>
-          <w:p>
+          <w:p wp14:textId="77777777">
             <w:pPr>
               <w:pStyle w:val="Normal"/>
               <w:spacing w:after="0" w:line="240" w:lineRule="auto"/>
@@ -8383,7 +8383,7 @@
             </w:tcMar>
             <w:hideMark/>
           </w:tcPr>
-          <w:p>
+          <w:p wp14:textId="77777777">
             <w:pPr>
               <w:pStyle w:val="Normal"/>
               <w:spacing w:after="0" w:line="240" w:lineRule="auto"/>
@@ -8398,7 +8398,7 @@
           </w:p>
         </w:tc>
       </w:tr>
-      <w:tr>
+      <w:tr xmlns:wp14="http://schemas.microsoft.com/office/word/2010/wordml" wp14:textId="77777777">
         <w:trPr>
           <w:cantSplit/>
           <w:trHeight w:val="500"/>
@@ -8413,16 +8413,16 @@
               <w:bottom w:val="single" w:color="000000" w:themeColor="text1" w:sz="8" w:space="0"/>
               <w:right w:val="single" w:color="000000" w:themeColor="text1" w:sz="8" w:space="0"/>
             </w:tcBorders>
-            <w:shd w:val="clear" w:color="auto" w:fill="F2F2F2"/>
-            <w:tcMar>
-              <w:top w:w="100" w:type="dxa"/>
-              <w:left w:w="100" w:type="dxa"/>
-              <w:bottom w:w="100" w:type="dxa"/>
-              <w:right w:w="100" w:type="dxa"/>
-            </w:tcMar>
-            <w:hideMark/>
-          </w:tcPr>
-          <w:p>
+            <w:shd w:val="clear" w:color="auto" w:fill="F2F2F2" w:themeFill="background1" w:themeFillShade="F2"/>
+            <w:tcMar>
+              <w:top w:w="100" w:type="dxa"/>
+              <w:left w:w="100" w:type="dxa"/>
+              <w:bottom w:w="100" w:type="dxa"/>
+              <w:right w:w="100" w:type="dxa"/>
+            </w:tcMar>
+            <w:hideMark/>
+          </w:tcPr>
+          <w:p wp14:textId="77777777">
             <w:pPr>
               <w:pStyle w:val="Normal"/>
               <w:keepNext/>
@@ -8440,7 +8440,7 @@
           </w:p>
         </w:tc>
       </w:tr>
-      <w:tr>
+      <w:tr xmlns:wp14="http://schemas.microsoft.com/office/word/2010/wordml" wp14:textId="77777777">
         <w:trPr>
           <w:cantSplit/>
           <w:trHeight w:val="500"/>
@@ -8462,7 +8462,7 @@
             </w:tcMar>
             <w:hideMark/>
           </w:tcPr>
-          <w:p>
+          <w:p wp14:textId="77777777">
             <w:pPr>
               <w:pStyle w:val="Normal"/>
               <w:spacing w:after="0" w:line="240" w:lineRule="auto"/>
@@ -8495,7 +8495,7 @@
             </w:tcMar>
             <w:hideMark/>
           </w:tcPr>
-          <w:p>
+          <w:p wp14:textId="77777777">
             <w:pPr>
               <w:pStyle w:val="Normal"/>
               <w:spacing w:after="0" w:line="240" w:lineRule="auto"/>
@@ -8526,7 +8526,7 @@
             </w:tcMar>
             <w:hideMark/>
           </w:tcPr>
-          <w:p>
+          <w:p wp14:textId="77777777">
             <w:pPr>
               <w:pStyle w:val="Normal"/>
               <w:spacing w:after="0" w:line="240" w:lineRule="auto"/>
@@ -8557,7 +8557,7 @@
             </w:tcMar>
             <w:hideMark/>
           </w:tcPr>
-          <w:p>
+          <w:p wp14:textId="77777777">
             <w:pPr>
               <w:pStyle w:val="Normal"/>
               <w:spacing w:after="0" w:line="240" w:lineRule="auto"/>
@@ -8588,7 +8588,7 @@
             </w:tcMar>
             <w:hideMark/>
           </w:tcPr>
-          <w:p>
+          <w:p wp14:textId="77777777">
             <w:pPr>
               <w:pStyle w:val="Normal"/>
               <w:spacing w:after="0" w:line="240" w:lineRule="auto"/>
@@ -8601,7 +8601,7 @@
               <w:t xml:space="preserve">UPI 45,0% (45.909)</w:t>
             </w:r>
           </w:p>
-          <w:p>
+          <w:p wp14:textId="77777777">
             <w:pPr>
               <w:pStyle w:val="Normal"/>
               <w:spacing w:after="0" w:line="240" w:lineRule="auto"/>
@@ -8614,7 +8614,7 @@
               <w:t xml:space="preserve">Cash 24,9% (25.367)</w:t>
             </w:r>
           </w:p>
-          <w:p>
+          <w:p wp14:textId="77777777">
             <w:pPr>
               <w:pStyle w:val="Normal"/>
               <w:spacing w:after="0" w:line="240" w:lineRule="auto"/>
@@ -8627,7 +8627,7 @@
               <w:t xml:space="preserve">Uber Wallet 12,0% (12.276)</w:t>
             </w:r>
           </w:p>
-          <w:p>
+          <w:p wp14:textId="77777777">
             <w:pPr>
               <w:pStyle w:val="Normal"/>
               <w:spacing w:after="0" w:line="240" w:lineRule="auto"/>
@@ -8640,7 +8640,7 @@
               <w:t xml:space="preserve">Credit Card 10,0% (10.209)</w:t>
             </w:r>
           </w:p>
-          <w:p>
+          <w:p wp14:textId="77777777">
             <w:pPr>
               <w:pStyle w:val="Normal"/>
               <w:spacing w:after="0" w:line="240" w:lineRule="auto"/>
@@ -8655,7 +8655,7 @@
           </w:p>
         </w:tc>
       </w:tr>
-      <w:tr>
+      <w:tr xmlns:wp14="http://schemas.microsoft.com/office/word/2010/wordml" wp14:textId="77777777">
         <w:trPr>
           <w:cantSplit/>
           <w:trHeight w:val="500"/>
@@ -8677,7 +8677,7 @@
             </w:tcMar>
             <w:hideMark/>
           </w:tcPr>
-          <w:p>
+          <w:p wp14:textId="77777777">
             <w:pPr>
               <w:pStyle w:val="Normal"/>
               <w:spacing w:after="0" w:line="240" w:lineRule="auto"/>
@@ -8710,7 +8710,7 @@
             </w:tcMar>
             <w:hideMark/>
           </w:tcPr>
-          <w:p>
+          <w:p wp14:textId="77777777">
             <w:pPr>
               <w:pStyle w:val="Normal"/>
               <w:spacing w:after="0" w:line="240" w:lineRule="auto"/>
@@ -8741,7 +8741,7 @@
             </w:tcMar>
             <w:hideMark/>
           </w:tcPr>
-          <w:p>
+          <w:p wp14:textId="77777777">
             <w:pPr>
               <w:pStyle w:val="Normal"/>
               <w:spacing w:after="0" w:line="240" w:lineRule="auto"/>
@@ -8772,7 +8772,7 @@
             </w:tcMar>
             <w:hideMark/>
           </w:tcPr>
-          <w:p>
+          <w:p wp14:textId="77777777">
             <w:pPr>
               <w:pStyle w:val="Normal"/>
               <w:spacing w:after="0" w:line="240" w:lineRule="auto"/>
@@ -8803,7 +8803,7 @@
             </w:tcMar>
             <w:hideMark/>
           </w:tcPr>
-          <w:p>
+          <w:p wp14:textId="77777777">
             <w:pPr>
               <w:pStyle w:val="Normal"/>
               <w:spacing w:after="0" w:line="240" w:lineRule="auto"/>
@@ -8816,7 +8816,7 @@
               <w:t xml:space="preserve">Credit Card: 510,1</w:t>
             </w:r>
           </w:p>
-          <w:p>
+          <w:p wp14:textId="77777777">
             <w:pPr>
               <w:pStyle w:val="Normal"/>
               <w:spacing w:after="0" w:line="240" w:lineRule="auto"/>
@@ -8829,7 +8829,7 @@
               <w:t xml:space="preserve">Cash: 508,6</w:t>
             </w:r>
           </w:p>
-          <w:p>
+          <w:p wp14:textId="77777777">
             <w:pPr>
               <w:pStyle w:val="Normal"/>
               <w:spacing w:after="0" w:line="240" w:lineRule="auto"/>
@@ -8842,7 +8842,7 @@
               <w:t xml:space="preserve">UPI: 508,5</w:t>
             </w:r>
           </w:p>
-          <w:p>
+          <w:p wp14:textId="77777777">
             <w:pPr>
               <w:pStyle w:val="Normal"/>
               <w:spacing w:after="0" w:line="240" w:lineRule="auto"/>
@@ -8855,7 +8855,7 @@
               <w:t xml:space="preserve">Debit Card: 505,9</w:t>
             </w:r>
           </w:p>
-          <w:p>
+          <w:p wp14:textId="77777777">
             <w:pPr>
               <w:pStyle w:val="Normal"/>
               <w:spacing w:after="0" w:line="240" w:lineRule="auto"/>
@@ -8868,7 +8868,7 @@
               <w:t xml:space="preserve">Uber Wallet: 505,9</w:t>
             </w:r>
           </w:p>
-          <w:p>
+          <w:p wp14:textId="77777777">
             <w:pPr>
               <w:pStyle w:val="Normal"/>
               <w:spacing w:after="0" w:line="240" w:lineRule="auto"/>
@@ -8883,7 +8883,7 @@
           </w:p>
         </w:tc>
       </w:tr>
-      <w:tr>
+      <w:tr xmlns:wp14="http://schemas.microsoft.com/office/word/2010/wordml" wp14:textId="77777777">
         <w:trPr>
           <w:cantSplit/>
           <w:trHeight w:val="500"/>
@@ -8898,16 +8898,16 @@
               <w:bottom w:val="single" w:color="000000" w:themeColor="text1" w:sz="8" w:space="0"/>
               <w:right w:val="single" w:color="000000" w:themeColor="text1" w:sz="8" w:space="0"/>
             </w:tcBorders>
-            <w:shd w:val="clear" w:color="auto" w:fill="F2F2F2"/>
-            <w:tcMar>
-              <w:top w:w="100" w:type="dxa"/>
-              <w:left w:w="100" w:type="dxa"/>
-              <w:bottom w:w="100" w:type="dxa"/>
-              <w:right w:w="100" w:type="dxa"/>
-            </w:tcMar>
-            <w:hideMark/>
-          </w:tcPr>
-          <w:p>
+            <w:shd w:val="clear" w:color="auto" w:fill="F2F2F2" w:themeFill="background1" w:themeFillShade="F2"/>
+            <w:tcMar>
+              <w:top w:w="100" w:type="dxa"/>
+              <w:left w:w="100" w:type="dxa"/>
+              <w:bottom w:w="100" w:type="dxa"/>
+              <w:right w:w="100" w:type="dxa"/>
+            </w:tcMar>
+            <w:hideMark/>
+          </w:tcPr>
+          <w:p wp14:textId="77777777">
             <w:pPr>
               <w:pStyle w:val="Normal"/>
               <w:keepNext/>
@@ -8925,7 +8925,7 @@
           </w:p>
         </w:tc>
       </w:tr>
-      <w:tr>
+      <w:tr xmlns:wp14="http://schemas.microsoft.com/office/word/2010/wordml" wp14:textId="77777777">
         <w:trPr>
           <w:cantSplit/>
           <w:trHeight w:val="500"/>
@@ -8947,7 +8947,7 @@
             </w:tcMar>
             <w:hideMark/>
           </w:tcPr>
-          <w:p>
+          <w:p wp14:textId="77777777">
             <w:pPr>
               <w:pStyle w:val="Normal"/>
               <w:spacing w:after="0" w:line="240" w:lineRule="auto"/>
@@ -8980,7 +8980,7 @@
             </w:tcMar>
             <w:hideMark/>
           </w:tcPr>
-          <w:p>
+          <w:p wp14:textId="77777777">
             <w:pPr>
               <w:pStyle w:val="Normal"/>
               <w:spacing w:after="0" w:line="240" w:lineRule="auto"/>
@@ -9011,7 +9011,7 @@
             </w:tcMar>
             <w:hideMark/>
           </w:tcPr>
-          <w:p>
+          <w:p wp14:textId="77777777">
             <w:pPr>
               <w:pStyle w:val="Normal"/>
               <w:spacing w:after="0" w:line="240" w:lineRule="auto"/>
@@ -9042,7 +9042,7 @@
             </w:tcMar>
             <w:hideMark/>
           </w:tcPr>
-          <w:p>
+          <w:p wp14:textId="77777777">
             <w:pPr>
               <w:pStyle w:val="Normal"/>
               <w:spacing w:after="0" w:line="240" w:lineRule="auto"/>
@@ -9073,7 +9073,7 @@
             </w:tcMar>
             <w:hideMark/>
           </w:tcPr>
-          <w:p>
+          <w:p wp14:textId="77777777">
             <w:pPr>
               <w:pStyle w:val="Normal"/>
               <w:spacing w:after="0" w:line="240" w:lineRule="auto"/>
@@ -9086,7 +9086,7 @@
               <w:t xml:space="preserve">Từ 61,4% (Go Sedan) đến 62,6% (Uber XL)</w:t>
             </w:r>
           </w:p>
-          <w:p>
+          <w:p wp14:textId="77777777">
             <w:pPr>
               <w:pStyle w:val="Normal"/>
               <w:spacing w:after="0" w:line="240" w:lineRule="auto"/>
@@ -9101,7 +9101,7 @@
           </w:p>
         </w:tc>
       </w:tr>
-      <w:tr>
+      <w:tr xmlns:wp14="http://schemas.microsoft.com/office/word/2010/wordml" wp14:textId="77777777">
         <w:trPr>
           <w:cantSplit/>
           <w:trHeight w:val="500"/>
@@ -9123,7 +9123,7 @@
             </w:tcMar>
             <w:hideMark/>
           </w:tcPr>
-          <w:p>
+          <w:p wp14:textId="77777777">
             <w:pPr>
               <w:pStyle w:val="Normal"/>
               <w:spacing w:after="0" w:line="240" w:lineRule="auto"/>
@@ -9156,7 +9156,7 @@
             </w:tcMar>
             <w:hideMark/>
           </w:tcPr>
-          <w:p>
+          <w:p wp14:textId="77777777">
             <w:pPr>
               <w:pStyle w:val="Normal"/>
               <w:spacing w:after="0" w:line="240" w:lineRule="auto"/>
@@ -9187,7 +9187,7 @@
             </w:tcMar>
             <w:hideMark/>
           </w:tcPr>
-          <w:p>
+          <w:p wp14:textId="77777777">
             <w:pPr>
               <w:pStyle w:val="Normal"/>
               <w:spacing w:after="0" w:line="240" w:lineRule="auto"/>
@@ -9218,7 +9218,7 @@
             </w:tcMar>
             <w:hideMark/>
           </w:tcPr>
-          <w:p>
+          <w:p wp14:textId="77777777">
             <w:pPr>
               <w:pStyle w:val="Normal"/>
               <w:spacing w:after="0" w:line="240" w:lineRule="auto"/>
@@ -9249,7 +9249,7 @@
             </w:tcMar>
             <w:hideMark/>
           </w:tcPr>
-          <w:p>
+          <w:p wp14:textId="77777777">
             <w:pPr>
               <w:pStyle w:val="Normal"/>
               <w:spacing w:after="0" w:line="240" w:lineRule="auto"/>
@@ -9262,7 +9262,7 @@
               <w:t xml:space="preserve">Auto: 11.727.615</w:t>
             </w:r>
           </w:p>
-          <w:p>
+          <w:p wp14:textId="77777777">
             <w:pPr>
               <w:pStyle w:val="Normal"/>
               <w:spacing w:after="0" w:line="240" w:lineRule="auto"/>
@@ -9275,7 +9275,7 @@
               <w:t xml:space="preserve">Go Mini: 9.411.418</w:t>
             </w:r>
           </w:p>
-          <w:p>
+          <w:p wp14:textId="77777777">
             <w:pPr>
               <w:pStyle w:val="Normal"/>
               <w:spacing w:after="0" w:line="240" w:lineRule="auto"/>
@@ -9288,7 +9288,7 @@
               <w:t xml:space="preserve">Go Sedan: 8.538.560</w:t>
             </w:r>
           </w:p>
-          <w:p>
+          <w:p wp14:textId="77777777">
             <w:pPr>
               <w:pStyle w:val="Normal"/>
               <w:spacing w:after="0" w:line="240" w:lineRule="auto"/>
@@ -9301,7 +9301,7 @@
               <w:t xml:space="preserve">Bike: 7.144.913</w:t>
             </w:r>
           </w:p>
-          <w:p>
+          <w:p wp14:textId="77777777">
             <w:pPr>
               <w:pStyle w:val="Normal"/>
               <w:spacing w:after="0" w:line="240" w:lineRule="auto"/>
@@ -9314,7 +9314,7 @@
               <w:t xml:space="preserve">Premier Sedan: 5.733.655</w:t>
             </w:r>
           </w:p>
-          <w:p>
+          <w:p wp14:textId="77777777">
             <w:pPr>
               <w:pStyle w:val="Normal"/>
               <w:spacing w:after="0" w:line="240" w:lineRule="auto"/>
@@ -9327,7 +9327,7 @@
               <w:t xml:space="preserve">eBike: 3.298.157</w:t>
             </w:r>
           </w:p>
-          <w:p>
+          <w:p wp14:textId="77777777">
             <w:pPr>
               <w:pStyle w:val="Normal"/>
               <w:spacing w:after="0" w:line="240" w:lineRule="auto"/>
@@ -9340,7 +9340,7 @@
               <w:t xml:space="preserve">Uber XL: 1.406.256</w:t>
             </w:r>
           </w:p>
-          <w:p>
+          <w:p wp14:textId="77777777">
             <w:pPr>
               <w:pStyle w:val="Normal"/>
               <w:spacing w:after="0" w:line="240" w:lineRule="auto"/>
@@ -9355,7 +9355,7 @@
           </w:p>
         </w:tc>
       </w:tr>
-      <w:tr>
+      <w:tr xmlns:wp14="http://schemas.microsoft.com/office/word/2010/wordml" wp14:textId="77777777">
         <w:trPr>
           <w:cantSplit/>
           <w:trHeight w:val="500"/>
@@ -9377,7 +9377,7 @@
             </w:tcMar>
             <w:hideMark/>
           </w:tcPr>
-          <w:p>
+          <w:p wp14:textId="77777777">
             <w:pPr>
               <w:pStyle w:val="Normal"/>
               <w:spacing w:after="0" w:line="240" w:lineRule="auto"/>
@@ -9410,7 +9410,7 @@
             </w:tcMar>
             <w:hideMark/>
           </w:tcPr>
-          <w:p>
+          <w:p wp14:textId="77777777">
             <w:pPr>
               <w:pStyle w:val="Normal"/>
               <w:spacing w:after="0" w:line="240" w:lineRule="auto"/>
@@ -9441,7 +9441,7 @@
             </w:tcMar>
             <w:hideMark/>
           </w:tcPr>
-          <w:p>
+          <w:p wp14:textId="77777777">
             <w:pPr>
               <w:pStyle w:val="Normal"/>
               <w:spacing w:after="0" w:line="240" w:lineRule="auto"/>
@@ -9472,7 +9472,7 @@
             </w:tcMar>
             <w:hideMark/>
           </w:tcPr>
-          <w:p>
+          <w:p wp14:textId="77777777">
             <w:pPr>
               <w:pStyle w:val="Normal"/>
               <w:spacing w:after="0" w:line="240" w:lineRule="auto"/>
@@ -9503,7 +9503,7 @@
             </w:tcMar>
             <w:hideMark/>
           </w:tcPr>
-          <w:p>
+          <w:p wp14:textId="77777777">
             <w:pPr>
               <w:pStyle w:val="Normal"/>
               <w:spacing w:after="0" w:line="240" w:lineRule="auto"/>
@@ -9516,7 +9516,7 @@
               <w:t xml:space="preserve">Từ 503,5 (eBike) đến 512,0 (Go Sedan)</w:t>
             </w:r>
           </w:p>
-          <w:p>
+          <w:p wp14:textId="77777777">
             <w:pPr>
               <w:pStyle w:val="Normal"/>
               <w:spacing w:after="0" w:line="240" w:lineRule="auto"/>
@@ -9532,7 +9532,596 @@
         </w:tc>
       </w:tr>
     </w:tbl>
-    <w:p xmlns:wp14="http://schemas.microsoft.com/office/word/2010/wordml" wp14:textId="77777777"/>
+    <w:p xmlns:wp14="http://schemas.microsoft.com/office/word/2010/wordml" wp14:textId="49A72FC2">
+      <w:pPr>
+        <w:pStyle w:val="Heading3"/>
+        <w:spacing w:before="281" w:beforeAutospacing="off" w:after="281" w:afterAutospacing="off"/>
+        <w:rPr>
+          <w:rFonts w:ascii="Calibri" w:hAnsi="Calibri" w:eastAsia="Calibri" w:cs="Calibri"/>
+          <w:b w:val="1"/>
+          <w:bCs w:val="1"/>
+          <w:noProof w:val="0"/>
+          <w:sz w:val="28"/>
+          <w:szCs w:val="28"/>
+          <w:lang w:val="en-US"/>
+        </w:rPr>
+      </w:pPr>
+    </w:p>
+    <w:p xmlns:wp14="http://schemas.microsoft.com/office/word/2010/wordml" wp14:textId="4A8AA663">
+      <w:pPr>
+        <w:pStyle w:val="Heading3"/>
+        <w:spacing w:before="281" w:beforeAutospacing="off" w:after="281" w:afterAutospacing="off"/>
+        <w:rPr>
+          <w:rFonts w:ascii="Calibri" w:hAnsi="Calibri" w:eastAsia="Calibri" w:cs="Calibri"/>
+          <w:b w:val="1"/>
+          <w:bCs w:val="1"/>
+          <w:noProof w:val="0"/>
+          <w:color w:val="auto"/>
+          <w:sz w:val="28"/>
+          <w:szCs w:val="28"/>
+          <w:lang w:val="en-US"/>
+        </w:rPr>
+      </w:pPr>
+      <w:r>
+        <w:rPr>
+          <w:rFonts w:ascii="Calibri" w:hAnsi="Calibri" w:eastAsia="Calibri" w:cs="Calibri"/>
+          <w:b w:val="1"/>
+          <w:bCs w:val="1"/>
+          <w:noProof w:val="0"/>
+          <w:color w:val="auto"/>
+          <w:sz w:val="28"/>
+          <w:szCs w:val="28"/>
+          <w:lang w:val="en-US"/>
+        </w:rPr>
+        <w:t>Kết quả kiểm định KPI bằng Python — Tuần 3</w:t>
+      </w:r>
+    </w:p>
+    <w:p xmlns:wp14="http://schemas.microsoft.com/office/word/2010/wordml" wp14:textId="20CA8727">
+      <w:pPr>
+        <w:spacing w:before="240" w:beforeAutospacing="off" w:after="240" w:afterAutospacing="off"/>
+      </w:pPr>
+      <w:r>
+        <w:rPr>
+          <w:rFonts w:ascii="Calibri" w:hAnsi="Calibri" w:eastAsia="Calibri" w:cs="Calibri"/>
+          <w:b w:val="1"/>
+          <w:bCs w:val="1"/>
+          <w:noProof w:val="0"/>
+          <w:sz w:val="22"/>
+          <w:szCs w:val="22"/>
+          <w:lang w:val="en-US"/>
+        </w:rPr>
+        <w:t>Nguồn dữ liệu:</w:t>
+      </w:r>
+      <w:r>
+        <w:rPr>
+          <w:rFonts w:ascii="Calibri" w:hAnsi="Calibri" w:eastAsia="Calibri" w:cs="Calibri"/>
+          <w:noProof w:val="0"/>
+          <w:sz w:val="22"/>
+          <w:szCs w:val="22"/>
+          <w:lang w:val="en-US"/>
+        </w:rPr>
+        <w:t xml:space="preserve"> ncr_ride_bookings.csv</w:t>
+      </w:r>
+    </w:p>
+    <w:p xmlns:wp14="http://schemas.microsoft.com/office/word/2010/wordml" wp14:textId="55E2D754">
+      <w:pPr>
+        <w:spacing w:before="240" w:beforeAutospacing="off" w:after="240" w:afterAutospacing="off"/>
+      </w:pPr>
+      <w:r>
+        <w:rPr>
+          <w:rFonts w:ascii="Calibri" w:hAnsi="Calibri" w:eastAsia="Calibri" w:cs="Calibri"/>
+          <w:b w:val="1"/>
+          <w:bCs w:val="1"/>
+          <w:noProof w:val="0"/>
+          <w:sz w:val="22"/>
+          <w:szCs w:val="22"/>
+          <w:lang w:val="en-US"/>
+        </w:rPr>
+        <w:t>Phương pháp:</w:t>
+      </w:r>
+      <w:r>
+        <w:rPr>
+          <w:rFonts w:ascii="Calibri" w:hAnsi="Calibri" w:eastAsia="Calibri" w:cs="Calibri"/>
+          <w:noProof w:val="0"/>
+          <w:sz w:val="22"/>
+          <w:szCs w:val="22"/>
+          <w:lang w:val="en-US"/>
+        </w:rPr>
+        <w:t xml:space="preserve"> Sử dụng Python và thư viện pandas để tính toán độc lập các KPI, sau đó đối chiếu với kết quả hiển thị trên Power BI.</w:t>
+      </w:r>
+    </w:p>
+    <w:tbl>
+      <w:tblPr>
+        <w:tblStyle w:val="TableNormal"/>
+        <w:bidiVisual w:val="0"/>
+        <w:tblW w:w="0" w:type="auto"/>
+        <w:tblBorders>
+          <w:top w:val="single" w:color="000000" w:themeColor="text1" w:sz="12"/>
+          <w:left w:val="single" w:color="000000" w:themeColor="text1" w:sz="12"/>
+          <w:bottom w:val="single" w:color="000000" w:themeColor="text1" w:sz="12"/>
+          <w:right w:val="single" w:color="000000" w:themeColor="text1" w:sz="12"/>
+          <w:insideH w:val="single" w:color="000000" w:themeColor="text1" w:sz="12"/>
+          <w:insideV w:val="single" w:color="000000" w:themeColor="text1" w:sz="12"/>
+        </w:tblBorders>
+        <w:tblLook w:val="06A0" w:firstRow="1" w:lastRow="0" w:firstColumn="1" w:lastColumn="0" w:noHBand="1" w:noVBand="1"/>
+      </w:tblPr>
+      <w:tblGrid>
+        <w:gridCol w:w="2333"/>
+        <w:gridCol w:w="1914"/>
+      </w:tblGrid>
+      <w:tr>
+        <w:trPr>
+          <w:trHeight w:val="300"/>
+        </w:trPr>
+        <w:tc>
+          <w:tcPr>
+            <w:tcW w:w="2333" w:type="dxa"/>
+            <w:tcMar/>
+            <w:vAlign w:val="center"/>
+          </w:tcPr>
+          <w:p>
+            <w:pPr>
+              <w:spacing w:before="0" w:beforeAutospacing="off" w:after="0" w:afterAutospacing="off"/>
+              <w:jc w:val="center"/>
+            </w:pPr>
+            <w:r>
+              <w:rPr>
+                <w:b w:val="1"/>
+                <w:bCs w:val="1"/>
+              </w:rPr>
+              <w:t>KPI</w:t>
+            </w:r>
+          </w:p>
+        </w:tc>
+        <w:tc>
+          <w:tcPr>
+            <w:tcW w:w="1914" w:type="dxa"/>
+            <w:tcMar/>
+            <w:vAlign w:val="center"/>
+          </w:tcPr>
+          <w:p>
+            <w:pPr>
+              <w:spacing w:before="0" w:beforeAutospacing="off" w:after="0" w:afterAutospacing="off"/>
+              <w:jc w:val="center"/>
+            </w:pPr>
+            <w:r>
+              <w:rPr>
+                <w:b w:val="1"/>
+                <w:bCs w:val="1"/>
+              </w:rPr>
+              <w:t>Kết quả Python</w:t>
+            </w:r>
+          </w:p>
+        </w:tc>
+      </w:tr>
+      <w:tr>
+        <w:trPr>
+          <w:trHeight w:val="300"/>
+        </w:trPr>
+        <w:tc>
+          <w:tcPr>
+            <w:tcW w:w="2333" w:type="dxa"/>
+            <w:tcMar/>
+            <w:vAlign w:val="center"/>
+          </w:tcPr>
+          <w:p>
+            <w:pPr>
+              <w:spacing w:before="0" w:beforeAutospacing="off" w:after="0" w:afterAutospacing="off"/>
+            </w:pPr>
+            <w:r>
+              <w:rPr/>
+              <w:t>Total Bookings</w:t>
+            </w:r>
+          </w:p>
+        </w:tc>
+        <w:tc>
+          <w:tcPr>
+            <w:tcW w:w="1914" w:type="dxa"/>
+            <w:tcMar/>
+            <w:vAlign w:val="center"/>
+          </w:tcPr>
+          <w:p>
+            <w:pPr>
+              <w:spacing w:before="0" w:beforeAutospacing="off" w:after="0" w:afterAutospacing="off"/>
+            </w:pPr>
+            <w:r>
+              <w:rPr/>
+              <w:t>150.000</w:t>
+            </w:r>
+          </w:p>
+        </w:tc>
+      </w:tr>
+      <w:tr>
+        <w:trPr>
+          <w:trHeight w:val="300"/>
+        </w:trPr>
+        <w:tc>
+          <w:tcPr>
+            <w:tcW w:w="2333" w:type="dxa"/>
+            <w:tcMar/>
+            <w:vAlign w:val="center"/>
+          </w:tcPr>
+          <w:p>
+            <w:pPr>
+              <w:spacing w:before="0" w:beforeAutospacing="off" w:after="0" w:afterAutospacing="off"/>
+            </w:pPr>
+            <w:r>
+              <w:rPr/>
+              <w:t>Completed Bookings</w:t>
+            </w:r>
+          </w:p>
+        </w:tc>
+        <w:tc>
+          <w:tcPr>
+            <w:tcW w:w="1914" w:type="dxa"/>
+            <w:tcMar/>
+            <w:vAlign w:val="center"/>
+          </w:tcPr>
+          <w:p>
+            <w:pPr>
+              <w:spacing w:before="0" w:beforeAutospacing="off" w:after="0" w:afterAutospacing="off"/>
+            </w:pPr>
+            <w:r>
+              <w:rPr/>
+              <w:t>93.000</w:t>
+            </w:r>
+          </w:p>
+        </w:tc>
+      </w:tr>
+      <w:tr>
+        <w:trPr>
+          <w:trHeight w:val="300"/>
+        </w:trPr>
+        <w:tc>
+          <w:tcPr>
+            <w:tcW w:w="2333" w:type="dxa"/>
+            <w:tcMar/>
+            <w:vAlign w:val="center"/>
+          </w:tcPr>
+          <w:p>
+            <w:pPr>
+              <w:spacing w:before="0" w:beforeAutospacing="off" w:after="0" w:afterAutospacing="off"/>
+            </w:pPr>
+            <w:r>
+              <w:rPr/>
+              <w:t>Completion Rate</w:t>
+            </w:r>
+          </w:p>
+        </w:tc>
+        <w:tc>
+          <w:tcPr>
+            <w:tcW w:w="1914" w:type="dxa"/>
+            <w:tcMar/>
+            <w:vAlign w:val="center"/>
+          </w:tcPr>
+          <w:p>
+            <w:pPr>
+              <w:spacing w:before="0" w:beforeAutospacing="off" w:after="0" w:afterAutospacing="off"/>
+            </w:pPr>
+            <w:r>
+              <w:rPr/>
+              <w:t>62,00%</w:t>
+            </w:r>
+          </w:p>
+        </w:tc>
+      </w:tr>
+      <w:tr>
+        <w:trPr>
+          <w:trHeight w:val="300"/>
+        </w:trPr>
+        <w:tc>
+          <w:tcPr>
+            <w:tcW w:w="2333" w:type="dxa"/>
+            <w:tcMar/>
+            <w:vAlign w:val="center"/>
+          </w:tcPr>
+          <w:p>
+            <w:pPr>
+              <w:spacing w:before="0" w:beforeAutospacing="off" w:after="0" w:afterAutospacing="off"/>
+            </w:pPr>
+            <w:r>
+              <w:rPr/>
+              <w:t>Revenue</w:t>
+            </w:r>
+          </w:p>
+        </w:tc>
+        <w:tc>
+          <w:tcPr>
+            <w:tcW w:w="1914" w:type="dxa"/>
+            <w:tcMar/>
+            <w:vAlign w:val="center"/>
+          </w:tcPr>
+          <w:p>
+            <w:pPr>
+              <w:spacing w:before="0" w:beforeAutospacing="off" w:after="0" w:afterAutospacing="off"/>
+            </w:pPr>
+            <w:r>
+              <w:rPr/>
+              <w:t>47.260.574</w:t>
+            </w:r>
+          </w:p>
+        </w:tc>
+      </w:tr>
+      <w:tr>
+        <w:trPr>
+          <w:trHeight w:val="300"/>
+        </w:trPr>
+        <w:tc>
+          <w:tcPr>
+            <w:tcW w:w="2333" w:type="dxa"/>
+            <w:tcMar/>
+            <w:vAlign w:val="center"/>
+          </w:tcPr>
+          <w:p>
+            <w:pPr>
+              <w:spacing w:before="0" w:beforeAutospacing="off" w:after="0" w:afterAutospacing="off"/>
+            </w:pPr>
+            <w:r>
+              <w:rPr/>
+              <w:t>AOV</w:t>
+            </w:r>
+          </w:p>
+        </w:tc>
+        <w:tc>
+          <w:tcPr>
+            <w:tcW w:w="1914" w:type="dxa"/>
+            <w:tcMar/>
+            <w:vAlign w:val="center"/>
+          </w:tcPr>
+          <w:p>
+            <w:pPr>
+              <w:spacing w:before="0" w:beforeAutospacing="off" w:after="0" w:afterAutospacing="off"/>
+            </w:pPr>
+            <w:r>
+              <w:rPr/>
+              <w:t>508,18</w:t>
+            </w:r>
+          </w:p>
+        </w:tc>
+      </w:tr>
+      <w:tr>
+        <w:trPr>
+          <w:trHeight w:val="300"/>
+        </w:trPr>
+        <w:tc>
+          <w:tcPr>
+            <w:tcW w:w="2333" w:type="dxa"/>
+            <w:tcMar/>
+            <w:vAlign w:val="center"/>
+          </w:tcPr>
+          <w:p>
+            <w:pPr>
+              <w:spacing w:before="0" w:beforeAutospacing="off" w:after="0" w:afterAutospacing="off"/>
+            </w:pPr>
+            <w:r>
+              <w:rPr/>
+              <w:t>Revenue at Risk</w:t>
+            </w:r>
+          </w:p>
+        </w:tc>
+        <w:tc>
+          <w:tcPr>
+            <w:tcW w:w="1914" w:type="dxa"/>
+            <w:tcMar/>
+            <w:vAlign w:val="center"/>
+          </w:tcPr>
+          <w:p>
+            <w:pPr>
+              <w:spacing w:before="0" w:beforeAutospacing="off" w:after="0" w:afterAutospacing="off"/>
+            </w:pPr>
+            <w:r>
+              <w:rPr/>
+              <w:t>24.392.554,32</w:t>
+            </w:r>
+          </w:p>
+        </w:tc>
+      </w:tr>
+      <w:tr>
+        <w:trPr>
+          <w:trHeight w:val="300"/>
+        </w:trPr>
+        <w:tc>
+          <w:tcPr>
+            <w:tcW w:w="2333" w:type="dxa"/>
+            <w:tcMar/>
+            <w:vAlign w:val="center"/>
+          </w:tcPr>
+          <w:p>
+            <w:pPr>
+              <w:spacing w:before="0" w:beforeAutospacing="off" w:after="0" w:afterAutospacing="off"/>
+            </w:pPr>
+            <w:r>
+              <w:rPr/>
+              <w:t>Avg VTAT</w:t>
+            </w:r>
+          </w:p>
+        </w:tc>
+        <w:tc>
+          <w:tcPr>
+            <w:tcW w:w="1914" w:type="dxa"/>
+            <w:tcMar/>
+            <w:vAlign w:val="center"/>
+          </w:tcPr>
+          <w:p>
+            <w:pPr>
+              <w:spacing w:before="0" w:beforeAutospacing="off" w:after="0" w:afterAutospacing="off"/>
+            </w:pPr>
+            <w:r>
+              <w:rPr/>
+              <w:t>8,46</w:t>
+            </w:r>
+          </w:p>
+        </w:tc>
+      </w:tr>
+      <w:tr>
+        <w:trPr>
+          <w:trHeight w:val="300"/>
+        </w:trPr>
+        <w:tc>
+          <w:tcPr>
+            <w:tcW w:w="2333" w:type="dxa"/>
+            <w:tcMar/>
+            <w:vAlign w:val="center"/>
+          </w:tcPr>
+          <w:p>
+            <w:pPr>
+              <w:spacing w:before="0" w:beforeAutospacing="off" w:after="0" w:afterAutospacing="off"/>
+            </w:pPr>
+            <w:r>
+              <w:rPr/>
+              <w:t>Peak Hour Bookings</w:t>
+            </w:r>
+          </w:p>
+        </w:tc>
+        <w:tc>
+          <w:tcPr>
+            <w:tcW w:w="1914" w:type="dxa"/>
+            <w:tcMar/>
+            <w:vAlign w:val="center"/>
+          </w:tcPr>
+          <w:p>
+            <w:pPr>
+              <w:spacing w:before="0" w:beforeAutospacing="off" w:after="0" w:afterAutospacing="off"/>
+            </w:pPr>
+            <w:r>
+              <w:rPr/>
+              <w:t>12.397 (18h)</w:t>
+            </w:r>
+          </w:p>
+        </w:tc>
+      </w:tr>
+      <w:tr>
+        <w:trPr>
+          <w:trHeight w:val="300"/>
+        </w:trPr>
+        <w:tc>
+          <w:tcPr>
+            <w:tcW w:w="2333" w:type="dxa"/>
+            <w:tcMar/>
+            <w:vAlign w:val="center"/>
+          </w:tcPr>
+          <w:p>
+            <w:pPr>
+              <w:spacing w:before="0" w:beforeAutospacing="off" w:after="0" w:afterAutospacing="off"/>
+            </w:pPr>
+            <w:r>
+              <w:rPr/>
+              <w:t>Peak-Hour Share</w:t>
+            </w:r>
+          </w:p>
+        </w:tc>
+        <w:tc>
+          <w:tcPr>
+            <w:tcW w:w="1914" w:type="dxa"/>
+            <w:tcMar/>
+            <w:vAlign w:val="center"/>
+          </w:tcPr>
+          <w:p>
+            <w:pPr>
+              <w:spacing w:before="0" w:beforeAutospacing="off" w:after="0" w:afterAutospacing="off"/>
+            </w:pPr>
+            <w:r>
+              <w:rPr/>
+              <w:t>22,99%</w:t>
+            </w:r>
+          </w:p>
+        </w:tc>
+      </w:tr>
+      <w:tr>
+        <w:trPr>
+          <w:trHeight w:val="300"/>
+        </w:trPr>
+        <w:tc>
+          <w:tcPr>
+            <w:tcW w:w="2333" w:type="dxa"/>
+            <w:tcMar/>
+            <w:vAlign w:val="center"/>
+          </w:tcPr>
+          <w:p>
+            <w:pPr>
+              <w:spacing w:before="0" w:beforeAutospacing="off" w:after="0" w:afterAutospacing="off"/>
+            </w:pPr>
+            <w:r>
+              <w:rPr/>
+              <w:t>Weekend Uplift</w:t>
+            </w:r>
+          </w:p>
+        </w:tc>
+        <w:tc>
+          <w:tcPr>
+            <w:tcW w:w="1914" w:type="dxa"/>
+            <w:tcMar/>
+            <w:vAlign w:val="center"/>
+          </w:tcPr>
+          <w:p>
+            <w:pPr>
+              <w:spacing w:before="0" w:beforeAutospacing="off" w:after="0" w:afterAutospacing="off"/>
+            </w:pPr>
+            <w:r>
+              <w:rPr/>
+              <w:t>0,66%</w:t>
+            </w:r>
+          </w:p>
+        </w:tc>
+      </w:tr>
+    </w:tbl>
+    <w:p xmlns:wp14="http://schemas.microsoft.com/office/word/2010/wordml" wp14:textId="5497EBD5">
+      <w:pPr>
+        <w:bidi w:val="0"/>
+        <w:spacing w:before="240" w:beforeAutospacing="off" w:after="240" w:afterAutospacing="off"/>
+      </w:pPr>
+      <w:r>
+        <w:rPr>
+          <w:rFonts w:ascii="Calibri" w:hAnsi="Calibri" w:eastAsia="Calibri" w:cs="Calibri"/>
+          <w:b w:val="1"/>
+          <w:bCs w:val="1"/>
+          <w:noProof w:val="0"/>
+          <w:sz w:val="22"/>
+          <w:szCs w:val="22"/>
+          <w:lang w:val="en-US"/>
+        </w:rPr>
+        <w:t>Nhận xét:</w:t>
+      </w:r>
+      <w:r>
+        <w:rPr>
+          <w:rFonts w:ascii="Calibri" w:hAnsi="Calibri" w:eastAsia="Calibri" w:cs="Calibri"/>
+          <w:noProof w:val="0"/>
+          <w:sz w:val="22"/>
+          <w:szCs w:val="22"/>
+          <w:lang w:val="en-US"/>
+        </w:rPr>
+        <w:t xml:space="preserve"> Các KPI được kiểm định có kết quả phù hợp với giá trị hiển thị trên Dashboard 1 và Dashboard 2 sau khi xét định dạng và làm tròn số. Riêng Revenue at Risk là giá trị cơ hội ước tính dựa trên AOV, không phải doanh thu thất thoát thực tế.</w:t>
+      </w:r>
+    </w:p>
+    <w:p xmlns:wp14="http://schemas.microsoft.com/office/word/2010/wordml" wp14:textId="36825BDC">
+      <w:pPr>
+        <w:bidi w:val="0"/>
+        <w:spacing w:before="240" w:beforeAutospacing="off" w:after="240" w:afterAutospacing="off"/>
+      </w:pPr>
+      <w:r>
+        <w:rPr>
+          <w:rFonts w:ascii="Calibri" w:hAnsi="Calibri" w:eastAsia="Calibri" w:cs="Calibri"/>
+          <w:b w:val="1"/>
+          <w:bCs w:val="1"/>
+          <w:noProof w:val="0"/>
+          <w:sz w:val="22"/>
+          <w:szCs w:val="22"/>
+          <w:lang w:val="en-US"/>
+        </w:rPr>
+        <w:t>Lưu ý:</w:t>
+      </w:r>
+      <w:r>
+        <w:rPr>
+          <w:rFonts w:ascii="Calibri" w:hAnsi="Calibri" w:eastAsia="Calibri" w:cs="Calibri"/>
+          <w:noProof w:val="0"/>
+          <w:sz w:val="22"/>
+          <w:szCs w:val="22"/>
+          <w:lang w:val="en-US"/>
+        </w:rPr>
+        <w:t xml:space="preserve"> Kết quả trên chưa bao gồm kiểm định thống kê các nhận xét về mức độ khác biệt theo giờ hoặc theo ngày trong tuần.</w:t>
+      </w:r>
+    </w:p>
+    <w:p xmlns:wp14="http://schemas.microsoft.com/office/word/2010/wordml" wp14:textId="6EF9B567"/>
     <w:sectPr>
       <w:pgSz w:w="12240" w:h="15840" w:orient="portrait"/>
       <w:pgMar w:top="1440" w:right="1440" w:bottom="1440" w:left="1440" w:header="720" w:footer="720" w:gutter="0"/>
@@ -9999,6 +10588,39 @@
       <w:szCs w:val="24"/>
     </w:rPr>
   </w:style>
+  <w:style xmlns:w14="http://schemas.microsoft.com/office/word/2010/wordml" xmlns:mc="http://schemas.openxmlformats.org/markup-compatibility/2006" xmlns:w="http://schemas.openxmlformats.org/wordprocessingml/2006/main" w:type="character" w:styleId="Heading3Char" w:customStyle="1" mc:Ignorable="w14">
+    <w:name xmlns:w="http://schemas.openxmlformats.org/wordprocessingml/2006/main" w:val="Heading 3 Char"/>
+    <w:basedOn xmlns:w="http://schemas.openxmlformats.org/wordprocessingml/2006/main" w:val="DefaultParagraphFont"/>
+    <w:link xmlns:w="http://schemas.openxmlformats.org/wordprocessingml/2006/main" w:val="Heading3"/>
+    <w:uiPriority xmlns:w="http://schemas.openxmlformats.org/wordprocessingml/2006/main" w:val="9"/>
+    <w:rPr xmlns:w="http://schemas.openxmlformats.org/wordprocessingml/2006/main">
+      <w:rFonts w:eastAsiaTheme="majorEastAsia" w:cstheme="majorBidi"/>
+      <w:color w:val="0F4761" w:themeColor="accent1" w:themeShade="BF"/>
+      <w:sz w:val="28"/>
+      <w:szCs w:val="28"/>
+    </w:rPr>
+  </w:style>
+  <w:style xmlns:w14="http://schemas.microsoft.com/office/word/2010/wordml" xmlns:mc="http://schemas.openxmlformats.org/markup-compatibility/2006" xmlns:w="http://schemas.openxmlformats.org/wordprocessingml/2006/main" w:type="paragraph" w:styleId="Heading3" mc:Ignorable="w14">
+    <w:name xmlns:w="http://schemas.openxmlformats.org/wordprocessingml/2006/main" w:val="heading 3"/>
+    <w:basedOn xmlns:w="http://schemas.openxmlformats.org/wordprocessingml/2006/main" w:val="Normal"/>
+    <w:next xmlns:w="http://schemas.openxmlformats.org/wordprocessingml/2006/main" w:val="Normal"/>
+    <w:link xmlns:w="http://schemas.openxmlformats.org/wordprocessingml/2006/main" w:val="Heading3Char"/>
+    <w:uiPriority xmlns:w="http://schemas.openxmlformats.org/wordprocessingml/2006/main" w:val="9"/>
+    <w:unhideWhenUsed xmlns:w="http://schemas.openxmlformats.org/wordprocessingml/2006/main"/>
+    <w:qFormat xmlns:w="http://schemas.openxmlformats.org/wordprocessingml/2006/main"/>
+    <w:pPr xmlns:w="http://schemas.openxmlformats.org/wordprocessingml/2006/main">
+      <w:keepNext xmlns:w="http://schemas.openxmlformats.org/wordprocessingml/2006/main"/>
+      <w:keepLines xmlns:w="http://schemas.openxmlformats.org/wordprocessingml/2006/main"/>
+      <w:spacing xmlns:w="http://schemas.openxmlformats.org/wordprocessingml/2006/main" w:before="160" w:after="80"/>
+      <w:outlineLvl xmlns:w="http://schemas.openxmlformats.org/wordprocessingml/2006/main" w:val="2"/>
+    </w:pPr>
+    <w:rPr xmlns:w="http://schemas.openxmlformats.org/wordprocessingml/2006/main">
+      <w:rFonts w:eastAsiaTheme="majorEastAsia" w:cstheme="majorBidi"/>
+      <w:color w:val="0F4761" w:themeColor="accent1" w:themeShade="BF"/>
+      <w:sz w:val="28"/>
+      <w:szCs w:val="28"/>
+    </w:rPr>
+  </w:style>
 </w:styles>
 </file>
 

</xml_diff>